<commit_message>
Remove em dashes, tighten tone to be more technical and concise
https://claude.ai/code/session_0156obd44T5mhgw32sBgaayU
</commit_message>
<xml_diff>
--- a/report_section_1_3_table.docx
+++ b/report_section_1_3_table.docx
@@ -15,7 +15,7 @@
         <w:rPr>
           <w:sz w:val="22"/>
         </w:rPr>
-        <w:t>Below is a summary of where each behavioural requirement stands in the final build. We defined 29 scenarios across 8 features in the Requirements Document. Of those, 27 have been fully met and 2 have not been implemented. Every single MUST-have requirement (BR1 through BR5 — 19 scenarios in total) is fully working. Out of the 10 SHOULD-have scenarios across BR6, BR7, and BR8, we got 8 done. Where we've changed something from the original spec, we've noted what changed and why.</w:t>
+        <w:t>The table below presents the status of each behavioural requirement from our Requirements Document. We defined 29 scenarios across 8 features. Of those, 27 are fully met and 2 are not implemented. All 19 MUST-have scenarios (BR1 through BR5) are fully working. Of the 10 SHOULD-have scenarios (BR6 through BR8), 8 are fully met and 2 are not. Where a requirement has been modified from the original specification, we have noted the change and our reasoning.</w:t>
       </w:r>
     </w:p>
     <w:tbl>
@@ -170,7 +170,7 @@
                 <w:b/>
                 <w:sz w:val="18"/>
               </w:rPr>
-              <w:t>BR1 — Account Management</w:t>
+              <w:t>BR1 – Account Management</w:t>
             </w:r>
           </w:p>
           <w:p>
@@ -585,7 +585,7 @@
                 <w:rFonts w:ascii="Calibri" w:hAnsi="Calibri"/>
                 <w:sz w:val="18"/>
               </w:rPr>
-              <w:t>Requires password confirmation and cascade-deletes all associated chats and messages.</w:t>
+              <w:t>Requires password confirmation. Cascade-deletes all associated chats and messages.</w:t>
             </w:r>
           </w:p>
         </w:tc>
@@ -605,7 +605,7 @@
                 <w:b/>
                 <w:sz w:val="18"/>
               </w:rPr>
-              <w:t>BR2 — New Chat with Log Upload</w:t>
+              <w:t>BR2 – New Chat with Log Upload</w:t>
             </w:r>
           </w:p>
           <w:p>
@@ -820,7 +820,7 @@
                 <w:rFonts w:ascii="Calibri" w:hAnsi="Calibri"/>
                 <w:sz w:val="18"/>
               </w:rPr>
-              <w:t>File extension is validated before parsing; non-CSV files get a clear error message.</w:t>
+              <w:t>File extension is validated before parsing. Non-CSV files receive a clear error message.</w:t>
             </w:r>
           </w:p>
         </w:tc>
@@ -1020,7 +1020,7 @@
                 <w:rFonts w:ascii="Calibri" w:hAnsi="Calibri"/>
                 <w:sz w:val="18"/>
               </w:rPr>
-              <w:t>Enforced architecturally — MainWindow only shows the chat screen after a successful login via QStackedWidget.</w:t>
+              <w:t>Enforced architecturally. MainWindow only shows the chat screen after successful login via QStackedWidget.</w:t>
             </w:r>
           </w:p>
         </w:tc>
@@ -1040,7 +1040,7 @@
                 <w:b/>
                 <w:sz w:val="18"/>
               </w:rPr>
-              <w:t>BR3 — Chat History Management</w:t>
+              <w:t>BR3 – Chat History Management</w:t>
             </w:r>
           </w:p>
           <w:p>
@@ -1455,7 +1455,7 @@
                 <w:rFonts w:ascii="Calibri" w:hAnsi="Calibri"/>
                 <w:sz w:val="18"/>
               </w:rPr>
-              <w:t>Now supports three export formats (plain text, JSON, Markdown) — the original spec didn't define specific formats so we expanded on it.</w:t>
+              <w:t>Now supports three export formats (plain text, JSON, Markdown). The original spec did not define specific formats, so we expanded on it.</w:t>
             </w:r>
           </w:p>
         </w:tc>
@@ -1475,7 +1475,7 @@
                 <w:b/>
                 <w:sz w:val="18"/>
               </w:rPr>
-              <w:t>BR4 — General Vehicle Status Queries</w:t>
+              <w:t>BR4 – General Vehicle Status Queries</w:t>
             </w:r>
           </w:p>
           <w:p>
@@ -1690,7 +1690,7 @@
                 <w:rFonts w:ascii="Calibri" w:hAnsi="Calibri"/>
                 <w:sz w:val="18"/>
               </w:rPr>
-              <w:t>Abnormal metrics are flagged with severity; the response highlights issues and gives recommendations.</w:t>
+              <w:t>Abnormal metrics are flagged with severity classification. The response highlights issues and provides recommendations.</w:t>
             </w:r>
           </w:p>
         </w:tc>
@@ -1790,7 +1790,7 @@
                 <w:rFonts w:ascii="Calibri" w:hAnsi="Calibri"/>
                 <w:sz w:val="18"/>
               </w:rPr>
-              <w:t>The system tells the user when requested data isn't present in the uploaded log.</w:t>
+              <w:t>The system states when requested data is not present in the uploaded log.</w:t>
             </w:r>
           </w:p>
         </w:tc>
@@ -1810,7 +1810,7 @@
                 <w:b/>
                 <w:sz w:val="18"/>
               </w:rPr>
-              <w:t>BR5 — Fault Code Explanation</w:t>
+              <w:t>BR5 – Fault Code Explanation</w:t>
             </w:r>
           </w:p>
           <w:p>
@@ -2125,7 +2125,7 @@
                 <w:rFonts w:ascii="Calibri" w:hAnsi="Calibri"/>
                 <w:sz w:val="18"/>
               </w:rPr>
-              <w:t>Manufacturer-specific codes are identified and the system explains that only generic OBD-II codes are supported.</w:t>
+              <w:t>Manufacturer-specific codes are identified. The system explains that only generic OBD-II codes are supported.</w:t>
             </w:r>
           </w:p>
         </w:tc>
@@ -2245,7 +2245,7 @@
                 <w:b/>
                 <w:sz w:val="18"/>
               </w:rPr>
-              <w:t>BR6 — Speech-to-Text Dictation</w:t>
+              <w:t>BR6 – Speech-to-Text Dictation</w:t>
             </w:r>
           </w:p>
           <w:p>
@@ -2460,7 +2460,7 @@
                 <w:rFonts w:ascii="Calibri" w:hAnsi="Calibri"/>
                 <w:sz w:val="18"/>
               </w:rPr>
-              <w:t>Dictated text gets appended to the end of the input box rather than inserted at the cursor. We prioritised getting the core voice pipeline working over this.</w:t>
+              <w:t>Dictated text is appended to the end of the input box rather than inserted at the cursor. We prioritised getting the core voice pipeline working over this refinement.</w:t>
             </w:r>
           </w:p>
         </w:tc>
@@ -2560,7 +2560,7 @@
                 <w:rFonts w:ascii="Calibri" w:hAnsi="Calibri"/>
                 <w:sz w:val="18"/>
               </w:rPr>
-              <w:t>Auto-stop triggers after 2 seconds of silence instead of 3. We lowered this after testing — 3 seconds felt sluggish and users kept thinking it was broken.</w:t>
+              <w:t>Auto-stop triggers after 2 seconds of silence instead of 3. We lowered this after testing showed 3 seconds felt unresponsive.</w:t>
             </w:r>
           </w:p>
         </w:tc>
@@ -2680,7 +2680,7 @@
                 <w:b/>
                 <w:sz w:val="18"/>
               </w:rPr>
-              <w:t>BR7 — Voice Conversation Mode</w:t>
+              <w:t>BR7 – Voice Conversation Mode</w:t>
             </w:r>
           </w:p>
           <w:p>
@@ -2995,7 +2995,7 @@
                 <w:rFonts w:ascii="Calibri" w:hAnsi="Calibri"/>
                 <w:sz w:val="18"/>
               </w:rPr>
-              <w:t>Not implemented — we use a button press instead. A wake word would need an always-on mic listener which conflicts with our privacy-first approach and would eat resources in the background.</w:t>
+              <w:t>Not implemented. We use a button press instead. Wake word detection would require an always-on mic listener, conflicting with our privacy-first approach and increasing background resource usage.</w:t>
             </w:r>
           </w:p>
         </w:tc>
@@ -3015,7 +3015,7 @@
                 <w:b/>
                 <w:sz w:val="18"/>
               </w:rPr>
-              <w:t>BR8 — Danger Level Categorisation</w:t>
+              <w:t>BR8 – Danger Level Categorisation</w:t>
             </w:r>
           </w:p>
           <w:p>
@@ -3130,7 +3130,7 @@
                 <w:rFonts w:ascii="Calibri" w:hAnsi="Calibri"/>
                 <w:sz w:val="18"/>
               </w:rPr>
-              <w:t>SeverityClassifier uses keyword analysis, fault code prefix matching (e.g. P03xx misfire codes), and metric thresholds. Messages show red styling with a "Critical" badge.</w:t>
+              <w:t>SeverityClassifier uses keyword analysis, fault code prefix matching (e.g. P03xx misfire codes), and metric thresholds. Messages display red styling with a "Critical" badge.</w:t>
             </w:r>
           </w:p>
         </w:tc>
@@ -3230,7 +3230,7 @@
                 <w:rFonts w:ascii="Calibri" w:hAnsi="Calibri"/>
                 <w:sz w:val="18"/>
               </w:rPr>
-              <w:t>Detected via keyword and metric analysis. Uses negation-aware detection so "no critical issue" doesn't get flagged as critical.</w:t>
+              <w:t>Detected via keyword and metric analysis. Uses negation-aware detection so phrases like "no critical issue" are not flagged as critical.</w:t>
             </w:r>
           </w:p>
         </w:tc>
@@ -3343,7 +3343,7 @@
           <w:rFonts w:ascii="Calibri" w:hAnsi="Calibri"/>
           <w:sz w:val="22"/>
         </w:rPr>
-        <w:t>The two scenarios we didn't implement (BR6.2 and BR7.3) were both SHOULD-haves that we made a conscious decision to deprioritise. BR6.2 — inserting dictated text at the cursor position — was a nice-to-have refinement but we focused our time on getting the core voice pipeline working properly instead. BR7.3 — wake word activation — would've needed an always-on microphone listener running in the background, which goes against the privacy-first approach we took with the rest of the system. We felt it was better to stick with a simple button press to start voice mode.</w:t>
+        <w:t>The two unimplemented scenarios are both SHOULD-haves. BR6.2 (inserting dictated text at the cursor position rather than appending) was deprioritised in favour of getting the core voice pipeline working reliably. BR7.3 (wake word activation) was not implemented because it would require an always-on microphone listener, which conflicts with our local-first, privacy-focused design and would increase background resource consumption.</w:t>
       </w:r>
     </w:p>
     <w:p>
@@ -3352,7 +3352,7 @@
           <w:rFonts w:ascii="Calibri" w:hAnsi="Calibri"/>
           <w:sz w:val="22"/>
         </w:rPr>
-        <w:t>Worth noting that the changes we did make were all intentional improvements, not cuts. Switching from IBM Granite STT to faster-whisper for speech recognition (BR6.1) was because we wanted everything to run locally without needing an internet connection. Adjusting the silence threshold from 3 seconds down to 2 (BR6.3, BR7.2) came out of our own testing — 3 seconds felt too slow and users kept thinking the system had frozen. And expanding chat export to support JSON and Markdown on top of plain text (BR3.4) was just something we thought would be useful, especially for developers who might want to look at the data programmatically.</w:t>
+        <w:t>All other modifications were intentional improvements. We switched from IBM Granite STT to faster-whisper for speech recognition (BR6.1) to keep everything running locally without an internet dependency. The silence detection threshold was reduced from 3 seconds to 2 (BR6.3, BR7.2) after user testing showed 3 seconds felt unresponsive. Chat export (BR3.4) was expanded to support JSON and Markdown alongside plain text, which we felt would be useful for developers wanting to work with the data programmatically.</w:t>
       </w:r>
     </w:p>
     <w:sectPr>

</xml_diff>

<commit_message>
Remove Priority column from section 1.3 table and rewrite descriptions
- Removed the Priority (MUST/SHOULD) column from the requirements table
- Rewrote justification descriptions to read more naturally while keeping
  academic tone
- Updated markdown prose to remove priority references
- Regenerated .docx table with cleaner formatting

https://claude.ai/code/session_0156obd44T5mhgw32sBgaayU
</commit_message>
<xml_diff>
--- a/report_section_1_3_table.docx
+++ b/report_section_1_3_table.docx
@@ -10,14 +10,6 @@
         <w:t>1.3 – Behavioural Requirements Status</w:t>
       </w:r>
     </w:p>
-    <w:p>
-      <w:r>
-        <w:rPr>
-          <w:sz w:val="22"/>
-        </w:rPr>
-        <w:t>The table below presents the status of each behavioural requirement from our Requirements Document. We defined 29 scenarios across 8 features. Of those, 27 are fully met and 2 are not implemented. All 19 MUST-have scenarios (BR1 through BR5) are fully working. Of the 10 SHOULD-have scenarios (BR6 through BR8), 8 are fully met and 2 are not. Where a requirement has been modified from the original specification, we have noted the change and our reasoning.</w:t>
-      </w:r>
-    </w:p>
     <w:tbl>
       <w:tblPr>
         <w:tblStyle w:val="TableGrid"/>
@@ -26,28 +18,27 @@
         <w:tblLook w:firstColumn="1" w:firstRow="1" w:lastColumn="0" w:lastRow="0" w:noHBand="0" w:noVBand="1" w:val="04A0"/>
       </w:tblPr>
       <w:tblGrid>
-        <w:gridCol w:w="1662"/>
-        <w:gridCol w:w="1662"/>
-        <w:gridCol w:w="1662"/>
-        <w:gridCol w:w="1662"/>
-        <w:gridCol w:w="1662"/>
-        <w:gridCol w:w="1662"/>
+        <w:gridCol w:w="1728"/>
+        <w:gridCol w:w="1728"/>
+        <w:gridCol w:w="1728"/>
+        <w:gridCol w:w="1728"/>
+        <w:gridCol w:w="1728"/>
       </w:tblGrid>
       <w:tr>
         <w:tc>
           <w:tcPr>
-            <w:tcW w:type="dxa" w:w="737"/>
-            <w:shd w:fill="4472C4" w:val="clear"/>
+            <w:tcW w:type="dxa" w:w="850"/>
+            <w:shd w:fill="D9E2F3" w:val="clear"/>
           </w:tcPr>
           <w:p>
             <w:pPr>
               <w:jc w:val="center"/>
             </w:pPr>
+            <w:r/>
             <w:r>
               <w:rPr>
                 <w:rFonts w:ascii="Calibri" w:hAnsi="Calibri"/>
                 <w:b/>
-                <w:color w:val="FFFFFF"/>
                 <w:sz w:val="18"/>
               </w:rPr>
               <w:t>Code</w:t>
@@ -56,18 +47,18 @@
         </w:tc>
         <w:tc>
           <w:tcPr>
-            <w:tcW w:type="dxa" w:w="1814"/>
-            <w:shd w:fill="4472C4" w:val="clear"/>
+            <w:tcW w:type="dxa" w:w="1984"/>
+            <w:shd w:fill="D9E2F3" w:val="clear"/>
           </w:tcPr>
           <w:p>
             <w:pPr>
               <w:jc w:val="center"/>
             </w:pPr>
+            <w:r/>
             <w:r>
               <w:rPr>
                 <w:rFonts w:ascii="Calibri" w:hAnsi="Calibri"/>
                 <w:b/>
-                <w:color w:val="FFFFFF"/>
                 <w:sz w:val="18"/>
               </w:rPr>
               <w:t>Description</w:t>
@@ -76,38 +67,18 @@
         </w:tc>
         <w:tc>
           <w:tcPr>
-            <w:tcW w:type="dxa" w:w="737"/>
-            <w:shd w:fill="4472C4" w:val="clear"/>
+            <w:tcW w:type="dxa" w:w="1020"/>
+            <w:shd w:fill="D9E2F3" w:val="clear"/>
           </w:tcPr>
           <w:p>
             <w:pPr>
               <w:jc w:val="center"/>
             </w:pPr>
+            <w:r/>
             <w:r>
               <w:rPr>
                 <w:rFonts w:ascii="Calibri" w:hAnsi="Calibri"/>
                 <w:b/>
-                <w:color w:val="FFFFFF"/>
-                <w:sz w:val="18"/>
-              </w:rPr>
-              <w:t>Priority</w:t>
-            </w:r>
-          </w:p>
-        </w:tc>
-        <w:tc>
-          <w:tcPr>
-            <w:tcW w:type="dxa" w:w="850"/>
-            <w:shd w:fill="4472C4" w:val="clear"/>
-          </w:tcPr>
-          <w:p>
-            <w:pPr>
-              <w:jc w:val="center"/>
-            </w:pPr>
-            <w:r>
-              <w:rPr>
-                <w:rFonts w:ascii="Calibri" w:hAnsi="Calibri"/>
-                <w:b/>
-                <w:color w:val="FFFFFF"/>
                 <w:sz w:val="18"/>
               </w:rPr>
               <w:t>Status</w:t>
@@ -116,18 +87,18 @@
         </w:tc>
         <w:tc>
           <w:tcPr>
-            <w:tcW w:type="dxa" w:w="964"/>
-            <w:shd w:fill="4472C4" w:val="clear"/>
+            <w:tcW w:type="dxa" w:w="1020"/>
+            <w:shd w:fill="D9E2F3" w:val="clear"/>
           </w:tcPr>
           <w:p>
             <w:pPr>
               <w:jc w:val="center"/>
             </w:pPr>
+            <w:r/>
             <w:r>
               <w:rPr>
                 <w:rFonts w:ascii="Calibri" w:hAnsi="Calibri"/>
                 <w:b/>
-                <w:color w:val="FFFFFF"/>
                 <w:sz w:val="18"/>
               </w:rPr>
               <w:t>Changed?</w:t>
@@ -136,18 +107,18 @@
         </w:tc>
         <w:tc>
           <w:tcPr>
-            <w:tcW w:type="dxa" w:w="4535"/>
-            <w:shd w:fill="4472C4" w:val="clear"/>
+            <w:tcW w:type="dxa" w:w="4819"/>
+            <w:shd w:fill="D9E2F3" w:val="clear"/>
           </w:tcPr>
           <w:p>
             <w:pPr>
               <w:jc w:val="center"/>
             </w:pPr>
+            <w:r/>
             <w:r>
               <w:rPr>
                 <w:rFonts w:ascii="Calibri" w:hAnsi="Calibri"/>
                 <w:b/>
-                <w:color w:val="FFFFFF"/>
                 <w:sz w:val="18"/>
               </w:rPr>
               <w:t>Justification</w:t>
@@ -158,9 +129,9 @@
       <w:tr>
         <w:tc>
           <w:tcPr>
-            <w:tcW w:type="dxa" w:w="4535"/>
-            <w:gridSpan w:val="6"/>
-            <w:shd w:fill="D6E4F0" w:val="clear"/>
+            <w:tcW w:type="dxa" w:w="9693"/>
+            <w:gridSpan w:val="5"/>
+            <w:shd w:fill="F2F2F2" w:val="clear"/>
           </w:tcPr>
           <w:p>
             <w:r/>
@@ -173,32 +144,18 @@
               <w:t>BR1 – Account Management</w:t>
             </w:r>
           </w:p>
-          <w:p>
-            <w:r/>
-          </w:p>
-          <w:p>
-            <w:r/>
-          </w:p>
-          <w:p>
-            <w:r/>
-          </w:p>
-          <w:p>
-            <w:r/>
-          </w:p>
-          <w:p>
-            <w:r/>
-          </w:p>
         </w:tc>
       </w:tr>
       <w:tr>
         <w:tc>
           <w:tcPr>
-            <w:tcW w:type="dxa" w:w="737"/>
+            <w:tcW w:type="dxa" w:w="850"/>
           </w:tcPr>
           <w:p>
             <w:pPr>
               <w:jc w:val="center"/>
             </w:pPr>
+            <w:r/>
             <w:r>
               <w:rPr>
                 <w:rFonts w:ascii="Calibri" w:hAnsi="Calibri"/>
@@ -210,9 +167,13 @@
         </w:tc>
         <w:tc>
           <w:tcPr>
-            <w:tcW w:type="dxa" w:w="1814"/>
+            <w:tcW w:type="dxa" w:w="1984"/>
           </w:tcPr>
           <w:p>
+            <w:pPr>
+              <w:jc w:val="center"/>
+            </w:pPr>
+            <w:r/>
             <w:r>
               <w:rPr>
                 <w:rFonts w:ascii="Calibri" w:hAnsi="Calibri"/>
@@ -224,34 +185,17 @@
         </w:tc>
         <w:tc>
           <w:tcPr>
-            <w:tcW w:type="dxa" w:w="737"/>
+            <w:tcW w:type="dxa" w:w="1020"/>
           </w:tcPr>
           <w:p>
             <w:pPr>
               <w:jc w:val="center"/>
             </w:pPr>
+            <w:r/>
             <w:r>
               <w:rPr>
                 <w:rFonts w:ascii="Calibri" w:hAnsi="Calibri"/>
-                <w:sz w:val="18"/>
-              </w:rPr>
-              <w:t>MUST</w:t>
-            </w:r>
-          </w:p>
-        </w:tc>
-        <w:tc>
-          <w:tcPr>
-            <w:tcW w:type="dxa" w:w="850"/>
-          </w:tcPr>
-          <w:p>
-            <w:pPr>
-              <w:jc w:val="center"/>
-            </w:pPr>
-            <w:r>
-              <w:rPr>
-                <w:rFonts w:ascii="Calibri" w:hAnsi="Calibri"/>
-                <w:b/>
-                <w:color w:val="008000"/>
+                <w:color w:val="228B22"/>
                 <w:sz w:val="18"/>
               </w:rPr>
               <w:t>Fully Met</w:t>
@@ -260,12 +204,13 @@
         </w:tc>
         <w:tc>
           <w:tcPr>
-            <w:tcW w:type="dxa" w:w="964"/>
+            <w:tcW w:type="dxa" w:w="1020"/>
           </w:tcPr>
           <w:p>
             <w:pPr>
               <w:jc w:val="center"/>
             </w:pPr>
+            <w:r/>
             <w:r>
               <w:rPr>
                 <w:rFonts w:ascii="Calibri" w:hAnsi="Calibri"/>
@@ -277,15 +222,16 @@
         </w:tc>
         <w:tc>
           <w:tcPr>
-            <w:tcW w:type="dxa" w:w="4535"/>
+            <w:tcW w:type="dxa" w:w="4819"/>
           </w:tcPr>
           <w:p>
+            <w:r/>
             <w:r>
               <w:rPr>
                 <w:rFonts w:ascii="Calibri" w:hAnsi="Calibri"/>
                 <w:sz w:val="18"/>
               </w:rPr>
-              <w:t>Implemented with input validation, bcrypt password hashing (12 rounds), and rate limiting (3 registrations per hour).</w:t>
+              <w:t>Accounts are created with validated inputs. Passwords are hashed with bcrypt (12 rounds) and registration is capped at 3 per hour to prevent abuse.</w:t>
             </w:r>
           </w:p>
         </w:tc>
@@ -293,12 +239,13 @@
       <w:tr>
         <w:tc>
           <w:tcPr>
-            <w:tcW w:type="dxa" w:w="737"/>
+            <w:tcW w:type="dxa" w:w="850"/>
           </w:tcPr>
           <w:p>
             <w:pPr>
               <w:jc w:val="center"/>
             </w:pPr>
+            <w:r/>
             <w:r>
               <w:rPr>
                 <w:rFonts w:ascii="Calibri" w:hAnsi="Calibri"/>
@@ -310,9 +257,13 @@
         </w:tc>
         <w:tc>
           <w:tcPr>
-            <w:tcW w:type="dxa" w:w="1814"/>
+            <w:tcW w:type="dxa" w:w="1984"/>
           </w:tcPr>
           <w:p>
+            <w:pPr>
+              <w:jc w:val="center"/>
+            </w:pPr>
+            <w:r/>
             <w:r>
               <w:rPr>
                 <w:rFonts w:ascii="Calibri" w:hAnsi="Calibri"/>
@@ -324,34 +275,17 @@
         </w:tc>
         <w:tc>
           <w:tcPr>
-            <w:tcW w:type="dxa" w:w="737"/>
+            <w:tcW w:type="dxa" w:w="1020"/>
           </w:tcPr>
           <w:p>
             <w:pPr>
               <w:jc w:val="center"/>
             </w:pPr>
+            <w:r/>
             <w:r>
               <w:rPr>
                 <w:rFonts w:ascii="Calibri" w:hAnsi="Calibri"/>
-                <w:sz w:val="18"/>
-              </w:rPr>
-              <w:t>MUST</w:t>
-            </w:r>
-          </w:p>
-        </w:tc>
-        <w:tc>
-          <w:tcPr>
-            <w:tcW w:type="dxa" w:w="850"/>
-          </w:tcPr>
-          <w:p>
-            <w:pPr>
-              <w:jc w:val="center"/>
-            </w:pPr>
-            <w:r>
-              <w:rPr>
-                <w:rFonts w:ascii="Calibri" w:hAnsi="Calibri"/>
-                <w:b/>
-                <w:color w:val="008000"/>
+                <w:color w:val="228B22"/>
                 <w:sz w:val="18"/>
               </w:rPr>
               <w:t>Fully Met</w:t>
@@ -360,12 +294,13 @@
         </w:tc>
         <w:tc>
           <w:tcPr>
-            <w:tcW w:type="dxa" w:w="964"/>
+            <w:tcW w:type="dxa" w:w="1020"/>
           </w:tcPr>
           <w:p>
             <w:pPr>
               <w:jc w:val="center"/>
             </w:pPr>
+            <w:r/>
             <w:r>
               <w:rPr>
                 <w:rFonts w:ascii="Calibri" w:hAnsi="Calibri"/>
@@ -377,15 +312,16 @@
         </w:tc>
         <w:tc>
           <w:tcPr>
-            <w:tcW w:type="dxa" w:w="4535"/>
+            <w:tcW w:type="dxa" w:w="4819"/>
           </w:tcPr>
           <w:p>
+            <w:r/>
             <w:r>
               <w:rPr>
                 <w:rFonts w:ascii="Calibri" w:hAnsi="Calibri"/>
                 <w:sz w:val="18"/>
               </w:rPr>
-              <w:t>Verifies credentials, generates a secure session token, and enforces rate limiting (5 attempts per 5 minutes).</w:t>
+              <w:t>Credentials are verified against stored hashes, a session token is issued on success, and login attempts are limited to 5 per 5-minute window.</w:t>
             </w:r>
           </w:p>
         </w:tc>
@@ -393,12 +329,13 @@
       <w:tr>
         <w:tc>
           <w:tcPr>
-            <w:tcW w:type="dxa" w:w="737"/>
+            <w:tcW w:type="dxa" w:w="850"/>
           </w:tcPr>
           <w:p>
             <w:pPr>
               <w:jc w:val="center"/>
             </w:pPr>
+            <w:r/>
             <w:r>
               <w:rPr>
                 <w:rFonts w:ascii="Calibri" w:hAnsi="Calibri"/>
@@ -410,9 +347,13 @@
         </w:tc>
         <w:tc>
           <w:tcPr>
-            <w:tcW w:type="dxa" w:w="1814"/>
+            <w:tcW w:type="dxa" w:w="1984"/>
           </w:tcPr>
           <w:p>
+            <w:pPr>
+              <w:jc w:val="center"/>
+            </w:pPr>
+            <w:r/>
             <w:r>
               <w:rPr>
                 <w:rFonts w:ascii="Calibri" w:hAnsi="Calibri"/>
@@ -424,34 +365,17 @@
         </w:tc>
         <w:tc>
           <w:tcPr>
-            <w:tcW w:type="dxa" w:w="737"/>
+            <w:tcW w:type="dxa" w:w="1020"/>
           </w:tcPr>
           <w:p>
             <w:pPr>
               <w:jc w:val="center"/>
             </w:pPr>
+            <w:r/>
             <w:r>
               <w:rPr>
                 <w:rFonts w:ascii="Calibri" w:hAnsi="Calibri"/>
-                <w:sz w:val="18"/>
-              </w:rPr>
-              <w:t>MUST</w:t>
-            </w:r>
-          </w:p>
-        </w:tc>
-        <w:tc>
-          <w:tcPr>
-            <w:tcW w:type="dxa" w:w="850"/>
-          </w:tcPr>
-          <w:p>
-            <w:pPr>
-              <w:jc w:val="center"/>
-            </w:pPr>
-            <w:r>
-              <w:rPr>
-                <w:rFonts w:ascii="Calibri" w:hAnsi="Calibri"/>
-                <w:b/>
-                <w:color w:val="008000"/>
+                <w:color w:val="228B22"/>
                 <w:sz w:val="18"/>
               </w:rPr>
               <w:t>Fully Met</w:t>
@@ -460,12 +384,13 @@
         </w:tc>
         <w:tc>
           <w:tcPr>
-            <w:tcW w:type="dxa" w:w="964"/>
+            <w:tcW w:type="dxa" w:w="1020"/>
           </w:tcPr>
           <w:p>
             <w:pPr>
               <w:jc w:val="center"/>
             </w:pPr>
+            <w:r/>
             <w:r>
               <w:rPr>
                 <w:rFonts w:ascii="Calibri" w:hAnsi="Calibri"/>
@@ -477,15 +402,16 @@
         </w:tc>
         <w:tc>
           <w:tcPr>
-            <w:tcW w:type="dxa" w:w="4535"/>
+            <w:tcW w:type="dxa" w:w="4819"/>
           </w:tcPr>
           <w:p>
+            <w:r/>
             <w:r>
               <w:rPr>
                 <w:rFonts w:ascii="Calibri" w:hAnsi="Calibri"/>
                 <w:sz w:val="18"/>
               </w:rPr>
-              <w:t>Invalidates the session token and redirects to the login screen.</w:t>
+              <w:t>The session token is invalidated and the user is returned to the login screen.</w:t>
             </w:r>
           </w:p>
         </w:tc>
@@ -493,12 +419,13 @@
       <w:tr>
         <w:tc>
           <w:tcPr>
-            <w:tcW w:type="dxa" w:w="737"/>
+            <w:tcW w:type="dxa" w:w="850"/>
           </w:tcPr>
           <w:p>
             <w:pPr>
               <w:jc w:val="center"/>
             </w:pPr>
+            <w:r/>
             <w:r>
               <w:rPr>
                 <w:rFonts w:ascii="Calibri" w:hAnsi="Calibri"/>
@@ -510,9 +437,13 @@
         </w:tc>
         <w:tc>
           <w:tcPr>
-            <w:tcW w:type="dxa" w:w="1814"/>
+            <w:tcW w:type="dxa" w:w="1984"/>
           </w:tcPr>
           <w:p>
+            <w:pPr>
+              <w:jc w:val="center"/>
+            </w:pPr>
+            <w:r/>
             <w:r>
               <w:rPr>
                 <w:rFonts w:ascii="Calibri" w:hAnsi="Calibri"/>
@@ -524,34 +455,17 @@
         </w:tc>
         <w:tc>
           <w:tcPr>
-            <w:tcW w:type="dxa" w:w="737"/>
+            <w:tcW w:type="dxa" w:w="1020"/>
           </w:tcPr>
           <w:p>
             <w:pPr>
               <w:jc w:val="center"/>
             </w:pPr>
+            <w:r/>
             <w:r>
               <w:rPr>
                 <w:rFonts w:ascii="Calibri" w:hAnsi="Calibri"/>
-                <w:sz w:val="18"/>
-              </w:rPr>
-              <w:t>MUST</w:t>
-            </w:r>
-          </w:p>
-        </w:tc>
-        <w:tc>
-          <w:tcPr>
-            <w:tcW w:type="dxa" w:w="850"/>
-          </w:tcPr>
-          <w:p>
-            <w:pPr>
-              <w:jc w:val="center"/>
-            </w:pPr>
-            <w:r>
-              <w:rPr>
-                <w:rFonts w:ascii="Calibri" w:hAnsi="Calibri"/>
-                <w:b/>
-                <w:color w:val="008000"/>
+                <w:color w:val="228B22"/>
                 <w:sz w:val="18"/>
               </w:rPr>
               <w:t>Fully Met</w:t>
@@ -560,12 +474,13 @@
         </w:tc>
         <w:tc>
           <w:tcPr>
-            <w:tcW w:type="dxa" w:w="964"/>
+            <w:tcW w:type="dxa" w:w="1020"/>
           </w:tcPr>
           <w:p>
             <w:pPr>
               <w:jc w:val="center"/>
             </w:pPr>
+            <w:r/>
             <w:r>
               <w:rPr>
                 <w:rFonts w:ascii="Calibri" w:hAnsi="Calibri"/>
@@ -577,15 +492,16 @@
         </w:tc>
         <w:tc>
           <w:tcPr>
-            <w:tcW w:type="dxa" w:w="4535"/>
+            <w:tcW w:type="dxa" w:w="4819"/>
           </w:tcPr>
           <w:p>
+            <w:r/>
             <w:r>
               <w:rPr>
                 <w:rFonts w:ascii="Calibri" w:hAnsi="Calibri"/>
                 <w:sz w:val="18"/>
               </w:rPr>
-              <w:t>Requires password confirmation. Cascade-deletes all associated chats and messages.</w:t>
+              <w:t>Requires the user to re-enter their password. All associated chats and messages are cascade-deleted.</w:t>
             </w:r>
           </w:p>
         </w:tc>
@@ -593,9 +509,9 @@
       <w:tr>
         <w:tc>
           <w:tcPr>
-            <w:tcW w:type="dxa" w:w="4535"/>
-            <w:gridSpan w:val="6"/>
-            <w:shd w:fill="D6E4F0" w:val="clear"/>
+            <w:tcW w:type="dxa" w:w="9693"/>
+            <w:gridSpan w:val="5"/>
+            <w:shd w:fill="F2F2F2" w:val="clear"/>
           </w:tcPr>
           <w:p>
             <w:r/>
@@ -608,32 +524,18 @@
               <w:t>BR2 – New Chat with Log Upload</w:t>
             </w:r>
           </w:p>
-          <w:p>
-            <w:r/>
-          </w:p>
-          <w:p>
-            <w:r/>
-          </w:p>
-          <w:p>
-            <w:r/>
-          </w:p>
-          <w:p>
-            <w:r/>
-          </w:p>
-          <w:p>
-            <w:r/>
-          </w:p>
         </w:tc>
       </w:tr>
       <w:tr>
         <w:tc>
           <w:tcPr>
-            <w:tcW w:type="dxa" w:w="737"/>
+            <w:tcW w:type="dxa" w:w="850"/>
           </w:tcPr>
           <w:p>
             <w:pPr>
               <w:jc w:val="center"/>
             </w:pPr>
+            <w:r/>
             <w:r>
               <w:rPr>
                 <w:rFonts w:ascii="Calibri" w:hAnsi="Calibri"/>
@@ -645,9 +547,13 @@
         </w:tc>
         <w:tc>
           <w:tcPr>
-            <w:tcW w:type="dxa" w:w="1814"/>
+            <w:tcW w:type="dxa" w:w="1984"/>
           </w:tcPr>
           <w:p>
+            <w:pPr>
+              <w:jc w:val="center"/>
+            </w:pPr>
+            <w:r/>
             <w:r>
               <w:rPr>
                 <w:rFonts w:ascii="Calibri" w:hAnsi="Calibri"/>
@@ -659,34 +565,17 @@
         </w:tc>
         <w:tc>
           <w:tcPr>
-            <w:tcW w:type="dxa" w:w="737"/>
+            <w:tcW w:type="dxa" w:w="1020"/>
           </w:tcPr>
           <w:p>
             <w:pPr>
               <w:jc w:val="center"/>
             </w:pPr>
+            <w:r/>
             <w:r>
               <w:rPr>
                 <w:rFonts w:ascii="Calibri" w:hAnsi="Calibri"/>
-                <w:sz w:val="18"/>
-              </w:rPr>
-              <w:t>MUST</w:t>
-            </w:r>
-          </w:p>
-        </w:tc>
-        <w:tc>
-          <w:tcPr>
-            <w:tcW w:type="dxa" w:w="850"/>
-          </w:tcPr>
-          <w:p>
-            <w:pPr>
-              <w:jc w:val="center"/>
-            </w:pPr>
-            <w:r>
-              <w:rPr>
-                <w:rFonts w:ascii="Calibri" w:hAnsi="Calibri"/>
-                <w:b/>
-                <w:color w:val="008000"/>
+                <w:color w:val="228B22"/>
                 <w:sz w:val="18"/>
               </w:rPr>
               <w:t>Fully Met</w:t>
@@ -695,12 +584,13 @@
         </w:tc>
         <w:tc>
           <w:tcPr>
-            <w:tcW w:type="dxa" w:w="964"/>
+            <w:tcW w:type="dxa" w:w="1020"/>
           </w:tcPr>
           <w:p>
             <w:pPr>
               <w:jc w:val="center"/>
             </w:pPr>
+            <w:r/>
             <w:r>
               <w:rPr>
                 <w:rFonts w:ascii="Calibri" w:hAnsi="Calibri"/>
@@ -712,15 +602,16 @@
         </w:tc>
         <w:tc>
           <w:tcPr>
-            <w:tcW w:type="dxa" w:w="4535"/>
+            <w:tcW w:type="dxa" w:w="4819"/>
           </w:tcPr>
           <w:p>
+            <w:r/>
             <w:r>
               <w:rPr>
                 <w:rFonts w:ascii="Calibri" w:hAnsi="Calibri"/>
                 <w:sz w:val="18"/>
               </w:rPr>
-              <w:t>OBDParser validates and parses the CSV, extracting 10+ metric types and identifying fault codes from a 185+ code database.</w:t>
+              <w:t>OBDParser validates the CSV structure and extracts 10+ metric types along with any fault codes from a database of over 185 codes.</w:t>
             </w:r>
           </w:p>
         </w:tc>
@@ -728,12 +619,13 @@
       <w:tr>
         <w:tc>
           <w:tcPr>
-            <w:tcW w:type="dxa" w:w="737"/>
+            <w:tcW w:type="dxa" w:w="850"/>
           </w:tcPr>
           <w:p>
             <w:pPr>
               <w:jc w:val="center"/>
             </w:pPr>
+            <w:r/>
             <w:r>
               <w:rPr>
                 <w:rFonts w:ascii="Calibri" w:hAnsi="Calibri"/>
@@ -745,9 +637,13 @@
         </w:tc>
         <w:tc>
           <w:tcPr>
-            <w:tcW w:type="dxa" w:w="1814"/>
+            <w:tcW w:type="dxa" w:w="1984"/>
           </w:tcPr>
           <w:p>
+            <w:pPr>
+              <w:jc w:val="center"/>
+            </w:pPr>
+            <w:r/>
             <w:r>
               <w:rPr>
                 <w:rFonts w:ascii="Calibri" w:hAnsi="Calibri"/>
@@ -759,34 +655,17 @@
         </w:tc>
         <w:tc>
           <w:tcPr>
-            <w:tcW w:type="dxa" w:w="737"/>
+            <w:tcW w:type="dxa" w:w="1020"/>
           </w:tcPr>
           <w:p>
             <w:pPr>
               <w:jc w:val="center"/>
             </w:pPr>
+            <w:r/>
             <w:r>
               <w:rPr>
                 <w:rFonts w:ascii="Calibri" w:hAnsi="Calibri"/>
-                <w:sz w:val="18"/>
-              </w:rPr>
-              <w:t>MUST</w:t>
-            </w:r>
-          </w:p>
-        </w:tc>
-        <w:tc>
-          <w:tcPr>
-            <w:tcW w:type="dxa" w:w="850"/>
-          </w:tcPr>
-          <w:p>
-            <w:pPr>
-              <w:jc w:val="center"/>
-            </w:pPr>
-            <w:r>
-              <w:rPr>
-                <w:rFonts w:ascii="Calibri" w:hAnsi="Calibri"/>
-                <w:b/>
-                <w:color w:val="008000"/>
+                <w:color w:val="228B22"/>
                 <w:sz w:val="18"/>
               </w:rPr>
               <w:t>Fully Met</w:t>
@@ -795,12 +674,13 @@
         </w:tc>
         <w:tc>
           <w:tcPr>
-            <w:tcW w:type="dxa" w:w="964"/>
+            <w:tcW w:type="dxa" w:w="1020"/>
           </w:tcPr>
           <w:p>
             <w:pPr>
               <w:jc w:val="center"/>
             </w:pPr>
+            <w:r/>
             <w:r>
               <w:rPr>
                 <w:rFonts w:ascii="Calibri" w:hAnsi="Calibri"/>
@@ -812,15 +692,16 @@
         </w:tc>
         <w:tc>
           <w:tcPr>
-            <w:tcW w:type="dxa" w:w="4535"/>
+            <w:tcW w:type="dxa" w:w="4819"/>
           </w:tcPr>
           <w:p>
+            <w:r/>
             <w:r>
               <w:rPr>
                 <w:rFonts w:ascii="Calibri" w:hAnsi="Calibri"/>
                 <w:sz w:val="18"/>
               </w:rPr>
-              <w:t>File extension is validated before parsing. Non-CSV files receive a clear error message.</w:t>
+              <w:t>The file extension is checked before parsing begins. Non-CSV uploads receive a descriptive error message.</w:t>
             </w:r>
           </w:p>
         </w:tc>
@@ -828,12 +709,13 @@
       <w:tr>
         <w:tc>
           <w:tcPr>
-            <w:tcW w:type="dxa" w:w="737"/>
+            <w:tcW w:type="dxa" w:w="850"/>
           </w:tcPr>
           <w:p>
             <w:pPr>
               <w:jc w:val="center"/>
             </w:pPr>
+            <w:r/>
             <w:r>
               <w:rPr>
                 <w:rFonts w:ascii="Calibri" w:hAnsi="Calibri"/>
@@ -845,9 +727,13 @@
         </w:tc>
         <w:tc>
           <w:tcPr>
-            <w:tcW w:type="dxa" w:w="1814"/>
+            <w:tcW w:type="dxa" w:w="1984"/>
           </w:tcPr>
           <w:p>
+            <w:pPr>
+              <w:jc w:val="center"/>
+            </w:pPr>
+            <w:r/>
             <w:r>
               <w:rPr>
                 <w:rFonts w:ascii="Calibri" w:hAnsi="Calibri"/>
@@ -859,34 +745,17 @@
         </w:tc>
         <w:tc>
           <w:tcPr>
-            <w:tcW w:type="dxa" w:w="737"/>
+            <w:tcW w:type="dxa" w:w="1020"/>
           </w:tcPr>
           <w:p>
             <w:pPr>
               <w:jc w:val="center"/>
             </w:pPr>
+            <w:r/>
             <w:r>
               <w:rPr>
                 <w:rFonts w:ascii="Calibri" w:hAnsi="Calibri"/>
-                <w:sz w:val="18"/>
-              </w:rPr>
-              <w:t>MUST</w:t>
-            </w:r>
-          </w:p>
-        </w:tc>
-        <w:tc>
-          <w:tcPr>
-            <w:tcW w:type="dxa" w:w="850"/>
-          </w:tcPr>
-          <w:p>
-            <w:pPr>
-              <w:jc w:val="center"/>
-            </w:pPr>
-            <w:r>
-              <w:rPr>
-                <w:rFonts w:ascii="Calibri" w:hAnsi="Calibri"/>
-                <w:b/>
-                <w:color w:val="008000"/>
+                <w:color w:val="228B22"/>
                 <w:sz w:val="18"/>
               </w:rPr>
               <w:t>Fully Met</w:t>
@@ -895,12 +764,13 @@
         </w:tc>
         <w:tc>
           <w:tcPr>
-            <w:tcW w:type="dxa" w:w="964"/>
+            <w:tcW w:type="dxa" w:w="1020"/>
           </w:tcPr>
           <w:p>
             <w:pPr>
               <w:jc w:val="center"/>
             </w:pPr>
+            <w:r/>
             <w:r>
               <w:rPr>
                 <w:rFonts w:ascii="Calibri" w:hAnsi="Calibri"/>
@@ -912,15 +782,16 @@
         </w:tc>
         <w:tc>
           <w:tcPr>
-            <w:tcW w:type="dxa" w:w="4535"/>
+            <w:tcW w:type="dxa" w:w="4819"/>
           </w:tcPr>
           <w:p>
+            <w:r/>
             <w:r>
               <w:rPr>
                 <w:rFonts w:ascii="Calibri" w:hAnsi="Calibri"/>
                 <w:sz w:val="18"/>
               </w:rPr>
-              <w:t>The parser detects missing OBD-II columns and corrupt data, returning descriptive errors for each case.</w:t>
+              <w:t>The parser catches missing OBD-II columns and corrupt values, returning specific error messages for each case.</w:t>
             </w:r>
           </w:p>
         </w:tc>
@@ -928,12 +799,13 @@
       <w:tr>
         <w:tc>
           <w:tcPr>
-            <w:tcW w:type="dxa" w:w="737"/>
+            <w:tcW w:type="dxa" w:w="850"/>
           </w:tcPr>
           <w:p>
             <w:pPr>
               <w:jc w:val="center"/>
             </w:pPr>
+            <w:r/>
             <w:r>
               <w:rPr>
                 <w:rFonts w:ascii="Calibri" w:hAnsi="Calibri"/>
@@ -945,9 +817,13 @@
         </w:tc>
         <w:tc>
           <w:tcPr>
-            <w:tcW w:type="dxa" w:w="1814"/>
+            <w:tcW w:type="dxa" w:w="1984"/>
           </w:tcPr>
           <w:p>
+            <w:pPr>
+              <w:jc w:val="center"/>
+            </w:pPr>
+            <w:r/>
             <w:r>
               <w:rPr>
                 <w:rFonts w:ascii="Calibri" w:hAnsi="Calibri"/>
@@ -959,34 +835,17 @@
         </w:tc>
         <w:tc>
           <w:tcPr>
-            <w:tcW w:type="dxa" w:w="737"/>
+            <w:tcW w:type="dxa" w:w="1020"/>
           </w:tcPr>
           <w:p>
             <w:pPr>
               <w:jc w:val="center"/>
             </w:pPr>
+            <w:r/>
             <w:r>
               <w:rPr>
                 <w:rFonts w:ascii="Calibri" w:hAnsi="Calibri"/>
-                <w:sz w:val="18"/>
-              </w:rPr>
-              <w:t>MUST</w:t>
-            </w:r>
-          </w:p>
-        </w:tc>
-        <w:tc>
-          <w:tcPr>
-            <w:tcW w:type="dxa" w:w="850"/>
-          </w:tcPr>
-          <w:p>
-            <w:pPr>
-              <w:jc w:val="center"/>
-            </w:pPr>
-            <w:r>
-              <w:rPr>
-                <w:rFonts w:ascii="Calibri" w:hAnsi="Calibri"/>
-                <w:b/>
-                <w:color w:val="008000"/>
+                <w:color w:val="228B22"/>
                 <w:sz w:val="18"/>
               </w:rPr>
               <w:t>Fully Met</w:t>
@@ -995,12 +854,13 @@
         </w:tc>
         <w:tc>
           <w:tcPr>
-            <w:tcW w:type="dxa" w:w="964"/>
+            <w:tcW w:type="dxa" w:w="1020"/>
           </w:tcPr>
           <w:p>
             <w:pPr>
               <w:jc w:val="center"/>
             </w:pPr>
+            <w:r/>
             <w:r>
               <w:rPr>
                 <w:rFonts w:ascii="Calibri" w:hAnsi="Calibri"/>
@@ -1012,15 +872,16 @@
         </w:tc>
         <w:tc>
           <w:tcPr>
-            <w:tcW w:type="dxa" w:w="4535"/>
+            <w:tcW w:type="dxa" w:w="4819"/>
           </w:tcPr>
           <w:p>
+            <w:r/>
             <w:r>
               <w:rPr>
                 <w:rFonts w:ascii="Calibri" w:hAnsi="Calibri"/>
                 <w:sz w:val="18"/>
               </w:rPr>
-              <w:t>Enforced architecturally. MainWindow only shows the chat screen after successful login via QStackedWidget.</w:t>
+              <w:t>Enforced at the UI level: the chat screen is only accessible after a successful login, managed through a QStackedWidget layout.</w:t>
             </w:r>
           </w:p>
         </w:tc>
@@ -1028,9 +889,9 @@
       <w:tr>
         <w:tc>
           <w:tcPr>
-            <w:tcW w:type="dxa" w:w="4535"/>
-            <w:gridSpan w:val="6"/>
-            <w:shd w:fill="D6E4F0" w:val="clear"/>
+            <w:tcW w:type="dxa" w:w="9693"/>
+            <w:gridSpan w:val="5"/>
+            <w:shd w:fill="F2F2F2" w:val="clear"/>
           </w:tcPr>
           <w:p>
             <w:r/>
@@ -1043,32 +904,18 @@
               <w:t>BR3 – Chat History Management</w:t>
             </w:r>
           </w:p>
-          <w:p>
-            <w:r/>
-          </w:p>
-          <w:p>
-            <w:r/>
-          </w:p>
-          <w:p>
-            <w:r/>
-          </w:p>
-          <w:p>
-            <w:r/>
-          </w:p>
-          <w:p>
-            <w:r/>
-          </w:p>
         </w:tc>
       </w:tr>
       <w:tr>
         <w:tc>
           <w:tcPr>
-            <w:tcW w:type="dxa" w:w="737"/>
+            <w:tcW w:type="dxa" w:w="850"/>
           </w:tcPr>
           <w:p>
             <w:pPr>
               <w:jc w:val="center"/>
             </w:pPr>
+            <w:r/>
             <w:r>
               <w:rPr>
                 <w:rFonts w:ascii="Calibri" w:hAnsi="Calibri"/>
@@ -1080,9 +927,13 @@
         </w:tc>
         <w:tc>
           <w:tcPr>
-            <w:tcW w:type="dxa" w:w="1814"/>
+            <w:tcW w:type="dxa" w:w="1984"/>
           </w:tcPr>
           <w:p>
+            <w:pPr>
+              <w:jc w:val="center"/>
+            </w:pPr>
+            <w:r/>
             <w:r>
               <w:rPr>
                 <w:rFonts w:ascii="Calibri" w:hAnsi="Calibri"/>
@@ -1094,34 +945,17 @@
         </w:tc>
         <w:tc>
           <w:tcPr>
-            <w:tcW w:type="dxa" w:w="737"/>
+            <w:tcW w:type="dxa" w:w="1020"/>
           </w:tcPr>
           <w:p>
             <w:pPr>
               <w:jc w:val="center"/>
             </w:pPr>
+            <w:r/>
             <w:r>
               <w:rPr>
                 <w:rFonts w:ascii="Calibri" w:hAnsi="Calibri"/>
-                <w:sz w:val="18"/>
-              </w:rPr>
-              <w:t>MUST</w:t>
-            </w:r>
-          </w:p>
-        </w:tc>
-        <w:tc>
-          <w:tcPr>
-            <w:tcW w:type="dxa" w:w="850"/>
-          </w:tcPr>
-          <w:p>
-            <w:pPr>
-              <w:jc w:val="center"/>
-            </w:pPr>
-            <w:r>
-              <w:rPr>
-                <w:rFonts w:ascii="Calibri" w:hAnsi="Calibri"/>
-                <w:b/>
-                <w:color w:val="008000"/>
+                <w:color w:val="228B22"/>
                 <w:sz w:val="18"/>
               </w:rPr>
               <w:t>Fully Met</w:t>
@@ -1130,12 +964,13 @@
         </w:tc>
         <w:tc>
           <w:tcPr>
-            <w:tcW w:type="dxa" w:w="964"/>
+            <w:tcW w:type="dxa" w:w="1020"/>
           </w:tcPr>
           <w:p>
             <w:pPr>
               <w:jc w:val="center"/>
             </w:pPr>
+            <w:r/>
             <w:r>
               <w:rPr>
                 <w:rFonts w:ascii="Calibri" w:hAnsi="Calibri"/>
@@ -1147,15 +982,16 @@
         </w:tc>
         <w:tc>
           <w:tcPr>
-            <w:tcW w:type="dxa" w:w="4535"/>
+            <w:tcW w:type="dxa" w:w="4819"/>
           </w:tcPr>
           <w:p>
+            <w:r/>
             <w:r>
               <w:rPr>
                 <w:rFonts w:ascii="Calibri" w:hAnsi="Calibri"/>
                 <w:sz w:val="18"/>
               </w:rPr>
-              <w:t>Retrieves all chats ordered by most recent, displayed in a sidebar list.</w:t>
+              <w:t>Previous chats are listed in the sidebar, ordered by most recent first.</w:t>
             </w:r>
           </w:p>
         </w:tc>
@@ -1163,12 +999,13 @@
       <w:tr>
         <w:tc>
           <w:tcPr>
-            <w:tcW w:type="dxa" w:w="737"/>
+            <w:tcW w:type="dxa" w:w="850"/>
           </w:tcPr>
           <w:p>
             <w:pPr>
               <w:jc w:val="center"/>
             </w:pPr>
+            <w:r/>
             <w:r>
               <w:rPr>
                 <w:rFonts w:ascii="Calibri" w:hAnsi="Calibri"/>
@@ -1180,9 +1017,13 @@
         </w:tc>
         <w:tc>
           <w:tcPr>
-            <w:tcW w:type="dxa" w:w="1814"/>
+            <w:tcW w:type="dxa" w:w="1984"/>
           </w:tcPr>
           <w:p>
+            <w:pPr>
+              <w:jc w:val="center"/>
+            </w:pPr>
+            <w:r/>
             <w:r>
               <w:rPr>
                 <w:rFonts w:ascii="Calibri" w:hAnsi="Calibri"/>
@@ -1194,34 +1035,17 @@
         </w:tc>
         <w:tc>
           <w:tcPr>
-            <w:tcW w:type="dxa" w:w="737"/>
+            <w:tcW w:type="dxa" w:w="1020"/>
           </w:tcPr>
           <w:p>
             <w:pPr>
               <w:jc w:val="center"/>
             </w:pPr>
+            <w:r/>
             <w:r>
               <w:rPr>
                 <w:rFonts w:ascii="Calibri" w:hAnsi="Calibri"/>
-                <w:sz w:val="18"/>
-              </w:rPr>
-              <w:t>MUST</w:t>
-            </w:r>
-          </w:p>
-        </w:tc>
-        <w:tc>
-          <w:tcPr>
-            <w:tcW w:type="dxa" w:w="850"/>
-          </w:tcPr>
-          <w:p>
-            <w:pPr>
-              <w:jc w:val="center"/>
-            </w:pPr>
-            <w:r>
-              <w:rPr>
-                <w:rFonts w:ascii="Calibri" w:hAnsi="Calibri"/>
-                <w:b/>
-                <w:color w:val="008000"/>
+                <w:color w:val="228B22"/>
                 <w:sz w:val="18"/>
               </w:rPr>
               <w:t>Fully Met</w:t>
@@ -1230,12 +1054,13 @@
         </w:tc>
         <w:tc>
           <w:tcPr>
-            <w:tcW w:type="dxa" w:w="964"/>
+            <w:tcW w:type="dxa" w:w="1020"/>
           </w:tcPr>
           <w:p>
             <w:pPr>
               <w:jc w:val="center"/>
             </w:pPr>
+            <w:r/>
             <w:r>
               <w:rPr>
                 <w:rFonts w:ascii="Calibri" w:hAnsi="Calibri"/>
@@ -1247,15 +1072,16 @@
         </w:tc>
         <w:tc>
           <w:tcPr>
-            <w:tcW w:type="dxa" w:w="4535"/>
+            <w:tcW w:type="dxa" w:w="4819"/>
           </w:tcPr>
           <w:p>
+            <w:r/>
             <w:r>
               <w:rPr>
                 <w:rFonts w:ascii="Calibri" w:hAnsi="Calibri"/>
                 <w:sz w:val="18"/>
               </w:rPr>
-              <w:t>Supports single and batch deletion with a confirmation dialog.</w:t>
+              <w:t>Users can delete individual chats or in batches. A confirmation dialog is shown before deletion.</w:t>
             </w:r>
           </w:p>
         </w:tc>
@@ -1263,12 +1089,13 @@
       <w:tr>
         <w:tc>
           <w:tcPr>
-            <w:tcW w:type="dxa" w:w="737"/>
+            <w:tcW w:type="dxa" w:w="850"/>
           </w:tcPr>
           <w:p>
             <w:pPr>
               <w:jc w:val="center"/>
             </w:pPr>
+            <w:r/>
             <w:r>
               <w:rPr>
                 <w:rFonts w:ascii="Calibri" w:hAnsi="Calibri"/>
@@ -1280,9 +1107,13 @@
         </w:tc>
         <w:tc>
           <w:tcPr>
-            <w:tcW w:type="dxa" w:w="1814"/>
+            <w:tcW w:type="dxa" w:w="1984"/>
           </w:tcPr>
           <w:p>
+            <w:pPr>
+              <w:jc w:val="center"/>
+            </w:pPr>
+            <w:r/>
             <w:r>
               <w:rPr>
                 <w:rFonts w:ascii="Calibri" w:hAnsi="Calibri"/>
@@ -1294,34 +1125,17 @@
         </w:tc>
         <w:tc>
           <w:tcPr>
-            <w:tcW w:type="dxa" w:w="737"/>
+            <w:tcW w:type="dxa" w:w="1020"/>
           </w:tcPr>
           <w:p>
             <w:pPr>
               <w:jc w:val="center"/>
             </w:pPr>
+            <w:r/>
             <w:r>
               <w:rPr>
                 <w:rFonts w:ascii="Calibri" w:hAnsi="Calibri"/>
-                <w:sz w:val="18"/>
-              </w:rPr>
-              <w:t>MUST</w:t>
-            </w:r>
-          </w:p>
-        </w:tc>
-        <w:tc>
-          <w:tcPr>
-            <w:tcW w:type="dxa" w:w="850"/>
-          </w:tcPr>
-          <w:p>
-            <w:pPr>
-              <w:jc w:val="center"/>
-            </w:pPr>
-            <w:r>
-              <w:rPr>
-                <w:rFonts w:ascii="Calibri" w:hAnsi="Calibri"/>
-                <w:b/>
-                <w:color w:val="008000"/>
+                <w:color w:val="228B22"/>
                 <w:sz w:val="18"/>
               </w:rPr>
               <w:t>Fully Met</w:t>
@@ -1330,12 +1144,13 @@
         </w:tc>
         <w:tc>
           <w:tcPr>
-            <w:tcW w:type="dxa" w:w="964"/>
+            <w:tcW w:type="dxa" w:w="1020"/>
           </w:tcPr>
           <w:p>
             <w:pPr>
               <w:jc w:val="center"/>
             </w:pPr>
+            <w:r/>
             <w:r>
               <w:rPr>
                 <w:rFonts w:ascii="Calibri" w:hAnsi="Calibri"/>
@@ -1347,15 +1162,16 @@
         </w:tc>
         <w:tc>
           <w:tcPr>
-            <w:tcW w:type="dxa" w:w="4535"/>
+            <w:tcW w:type="dxa" w:w="4819"/>
           </w:tcPr>
           <w:p>
+            <w:r/>
             <w:r>
               <w:rPr>
                 <w:rFonts w:ascii="Calibri" w:hAnsi="Calibri"/>
                 <w:sz w:val="18"/>
               </w:rPr>
-              <w:t>Context menu with QInputDialog for inline renaming.</w:t>
+              <w:t>Accessible via right-click context menu, with a QInputDialog for inline renaming.</w:t>
             </w:r>
           </w:p>
         </w:tc>
@@ -1363,12 +1179,13 @@
       <w:tr>
         <w:tc>
           <w:tcPr>
-            <w:tcW w:type="dxa" w:w="737"/>
+            <w:tcW w:type="dxa" w:w="850"/>
           </w:tcPr>
           <w:p>
             <w:pPr>
               <w:jc w:val="center"/>
             </w:pPr>
+            <w:r/>
             <w:r>
               <w:rPr>
                 <w:rFonts w:ascii="Calibri" w:hAnsi="Calibri"/>
@@ -1380,9 +1197,13 @@
         </w:tc>
         <w:tc>
           <w:tcPr>
-            <w:tcW w:type="dxa" w:w="1814"/>
+            <w:tcW w:type="dxa" w:w="1984"/>
           </w:tcPr>
           <w:p>
+            <w:pPr>
+              <w:jc w:val="center"/>
+            </w:pPr>
+            <w:r/>
             <w:r>
               <w:rPr>
                 <w:rFonts w:ascii="Calibri" w:hAnsi="Calibri"/>
@@ -1394,34 +1215,17 @@
         </w:tc>
         <w:tc>
           <w:tcPr>
-            <w:tcW w:type="dxa" w:w="737"/>
+            <w:tcW w:type="dxa" w:w="1020"/>
           </w:tcPr>
           <w:p>
             <w:pPr>
               <w:jc w:val="center"/>
             </w:pPr>
+            <w:r/>
             <w:r>
               <w:rPr>
                 <w:rFonts w:ascii="Calibri" w:hAnsi="Calibri"/>
-                <w:sz w:val="18"/>
-              </w:rPr>
-              <w:t>MUST</w:t>
-            </w:r>
-          </w:p>
-        </w:tc>
-        <w:tc>
-          <w:tcPr>
-            <w:tcW w:type="dxa" w:w="850"/>
-          </w:tcPr>
-          <w:p>
-            <w:pPr>
-              <w:jc w:val="center"/>
-            </w:pPr>
-            <w:r>
-              <w:rPr>
-                <w:rFonts w:ascii="Calibri" w:hAnsi="Calibri"/>
-                <w:b/>
-                <w:color w:val="008000"/>
+                <w:color w:val="228B22"/>
                 <w:sz w:val="18"/>
               </w:rPr>
               <w:t>Fully Met</w:t>
@@ -1430,12 +1234,13 @@
         </w:tc>
         <w:tc>
           <w:tcPr>
-            <w:tcW w:type="dxa" w:w="964"/>
+            <w:tcW w:type="dxa" w:w="1020"/>
           </w:tcPr>
           <w:p>
             <w:pPr>
               <w:jc w:val="center"/>
             </w:pPr>
+            <w:r/>
             <w:r>
               <w:rPr>
                 <w:rFonts w:ascii="Calibri" w:hAnsi="Calibri"/>
@@ -1447,15 +1252,16 @@
         </w:tc>
         <w:tc>
           <w:tcPr>
-            <w:tcW w:type="dxa" w:w="4535"/>
+            <w:tcW w:type="dxa" w:w="4819"/>
           </w:tcPr>
           <w:p>
+            <w:r/>
             <w:r>
               <w:rPr>
                 <w:rFonts w:ascii="Calibri" w:hAnsi="Calibri"/>
                 <w:sz w:val="18"/>
               </w:rPr>
-              <w:t>Now supports three export formats (plain text, JSON, Markdown). The original spec did not define specific formats, so we expanded on it.</w:t>
+              <w:t>Extended to support three export formats: plain text, JSON, and Markdown. The original spec left the format unspecified, so we broadened support.</w:t>
             </w:r>
           </w:p>
         </w:tc>
@@ -1463,9 +1269,9 @@
       <w:tr>
         <w:tc>
           <w:tcPr>
-            <w:tcW w:type="dxa" w:w="4535"/>
-            <w:gridSpan w:val="6"/>
-            <w:shd w:fill="D6E4F0" w:val="clear"/>
+            <w:tcW w:type="dxa" w:w="9693"/>
+            <w:gridSpan w:val="5"/>
+            <w:shd w:fill="F2F2F2" w:val="clear"/>
           </w:tcPr>
           <w:p>
             <w:r/>
@@ -1478,32 +1284,18 @@
               <w:t>BR4 – General Vehicle Status Queries</w:t>
             </w:r>
           </w:p>
-          <w:p>
-            <w:r/>
-          </w:p>
-          <w:p>
-            <w:r/>
-          </w:p>
-          <w:p>
-            <w:r/>
-          </w:p>
-          <w:p>
-            <w:r/>
-          </w:p>
-          <w:p>
-            <w:r/>
-          </w:p>
         </w:tc>
       </w:tr>
       <w:tr>
         <w:tc>
           <w:tcPr>
-            <w:tcW w:type="dxa" w:w="737"/>
+            <w:tcW w:type="dxa" w:w="850"/>
           </w:tcPr>
           <w:p>
             <w:pPr>
               <w:jc w:val="center"/>
             </w:pPr>
+            <w:r/>
             <w:r>
               <w:rPr>
                 <w:rFonts w:ascii="Calibri" w:hAnsi="Calibri"/>
@@ -1515,9 +1307,13 @@
         </w:tc>
         <w:tc>
           <w:tcPr>
-            <w:tcW w:type="dxa" w:w="1814"/>
+            <w:tcW w:type="dxa" w:w="1984"/>
           </w:tcPr>
           <w:p>
+            <w:pPr>
+              <w:jc w:val="center"/>
+            </w:pPr>
+            <w:r/>
             <w:r>
               <w:rPr>
                 <w:rFonts w:ascii="Calibri" w:hAnsi="Calibri"/>
@@ -1529,34 +1325,17 @@
         </w:tc>
         <w:tc>
           <w:tcPr>
-            <w:tcW w:type="dxa" w:w="737"/>
+            <w:tcW w:type="dxa" w:w="1020"/>
           </w:tcPr>
           <w:p>
             <w:pPr>
               <w:jc w:val="center"/>
             </w:pPr>
+            <w:r/>
             <w:r>
               <w:rPr>
                 <w:rFonts w:ascii="Calibri" w:hAnsi="Calibri"/>
-                <w:sz w:val="18"/>
-              </w:rPr>
-              <w:t>MUST</w:t>
-            </w:r>
-          </w:p>
-        </w:tc>
-        <w:tc>
-          <w:tcPr>
-            <w:tcW w:type="dxa" w:w="850"/>
-          </w:tcPr>
-          <w:p>
-            <w:pPr>
-              <w:jc w:val="center"/>
-            </w:pPr>
-            <w:r>
-              <w:rPr>
-                <w:rFonts w:ascii="Calibri" w:hAnsi="Calibri"/>
-                <w:b/>
-                <w:color w:val="008000"/>
+                <w:color w:val="228B22"/>
                 <w:sz w:val="18"/>
               </w:rPr>
               <w:t>Fully Met</w:t>
@@ -1565,12 +1344,13 @@
         </w:tc>
         <w:tc>
           <w:tcPr>
-            <w:tcW w:type="dxa" w:w="964"/>
+            <w:tcW w:type="dxa" w:w="1020"/>
           </w:tcPr>
           <w:p>
             <w:pPr>
               <w:jc w:val="center"/>
             </w:pPr>
+            <w:r/>
             <w:r>
               <w:rPr>
                 <w:rFonts w:ascii="Calibri" w:hAnsi="Calibri"/>
@@ -1582,15 +1362,16 @@
         </w:tc>
         <w:tc>
           <w:tcPr>
-            <w:tcW w:type="dxa" w:w="4535"/>
+            <w:tcW w:type="dxa" w:w="4819"/>
           </w:tcPr>
           <w:p>
+            <w:r/>
             <w:r>
               <w:rPr>
                 <w:rFonts w:ascii="Calibri" w:hAnsi="Calibri"/>
                 <w:sz w:val="18"/>
               </w:rPr>
-              <w:t>RAG pipeline generates a health summary confirming normal status with specific metric readings.</w:t>
+              <w:t>The RAG pipeline produces a health summary confirming normal readings, citing specific metric values from the log.</w:t>
             </w:r>
           </w:p>
         </w:tc>
@@ -1598,12 +1379,13 @@
       <w:tr>
         <w:tc>
           <w:tcPr>
-            <w:tcW w:type="dxa" w:w="737"/>
+            <w:tcW w:type="dxa" w:w="850"/>
           </w:tcPr>
           <w:p>
             <w:pPr>
               <w:jc w:val="center"/>
             </w:pPr>
+            <w:r/>
             <w:r>
               <w:rPr>
                 <w:rFonts w:ascii="Calibri" w:hAnsi="Calibri"/>
@@ -1615,9 +1397,13 @@
         </w:tc>
         <w:tc>
           <w:tcPr>
-            <w:tcW w:type="dxa" w:w="1814"/>
+            <w:tcW w:type="dxa" w:w="1984"/>
           </w:tcPr>
           <w:p>
+            <w:pPr>
+              <w:jc w:val="center"/>
+            </w:pPr>
+            <w:r/>
             <w:r>
               <w:rPr>
                 <w:rFonts w:ascii="Calibri" w:hAnsi="Calibri"/>
@@ -1629,34 +1415,17 @@
         </w:tc>
         <w:tc>
           <w:tcPr>
-            <w:tcW w:type="dxa" w:w="737"/>
+            <w:tcW w:type="dxa" w:w="1020"/>
           </w:tcPr>
           <w:p>
             <w:pPr>
               <w:jc w:val="center"/>
             </w:pPr>
+            <w:r/>
             <w:r>
               <w:rPr>
                 <w:rFonts w:ascii="Calibri" w:hAnsi="Calibri"/>
-                <w:sz w:val="18"/>
-              </w:rPr>
-              <w:t>MUST</w:t>
-            </w:r>
-          </w:p>
-        </w:tc>
-        <w:tc>
-          <w:tcPr>
-            <w:tcW w:type="dxa" w:w="850"/>
-          </w:tcPr>
-          <w:p>
-            <w:pPr>
-              <w:jc w:val="center"/>
-            </w:pPr>
-            <w:r>
-              <w:rPr>
-                <w:rFonts w:ascii="Calibri" w:hAnsi="Calibri"/>
-                <w:b/>
-                <w:color w:val="008000"/>
+                <w:color w:val="228B22"/>
                 <w:sz w:val="18"/>
               </w:rPr>
               <w:t>Fully Met</w:t>
@@ -1665,12 +1434,13 @@
         </w:tc>
         <w:tc>
           <w:tcPr>
-            <w:tcW w:type="dxa" w:w="964"/>
+            <w:tcW w:type="dxa" w:w="1020"/>
           </w:tcPr>
           <w:p>
             <w:pPr>
               <w:jc w:val="center"/>
             </w:pPr>
+            <w:r/>
             <w:r>
               <w:rPr>
                 <w:rFonts w:ascii="Calibri" w:hAnsi="Calibri"/>
@@ -1682,15 +1452,16 @@
         </w:tc>
         <w:tc>
           <w:tcPr>
-            <w:tcW w:type="dxa" w:w="4535"/>
+            <w:tcW w:type="dxa" w:w="4819"/>
           </w:tcPr>
           <w:p>
+            <w:r/>
             <w:r>
               <w:rPr>
                 <w:rFonts w:ascii="Calibri" w:hAnsi="Calibri"/>
                 <w:sz w:val="18"/>
               </w:rPr>
-              <w:t>Abnormal metrics are flagged with severity classification. The response highlights issues and provides recommendations.</w:t>
+              <w:t>Out-of-range metrics are flagged with a severity level. The response highlights the issues and offers recommendations.</w:t>
             </w:r>
           </w:p>
         </w:tc>
@@ -1698,12 +1469,13 @@
       <w:tr>
         <w:tc>
           <w:tcPr>
-            <w:tcW w:type="dxa" w:w="737"/>
+            <w:tcW w:type="dxa" w:w="850"/>
           </w:tcPr>
           <w:p>
             <w:pPr>
               <w:jc w:val="center"/>
             </w:pPr>
+            <w:r/>
             <w:r>
               <w:rPr>
                 <w:rFonts w:ascii="Calibri" w:hAnsi="Calibri"/>
@@ -1715,9 +1487,13 @@
         </w:tc>
         <w:tc>
           <w:tcPr>
-            <w:tcW w:type="dxa" w:w="1814"/>
+            <w:tcW w:type="dxa" w:w="1984"/>
           </w:tcPr>
           <w:p>
+            <w:pPr>
+              <w:jc w:val="center"/>
+            </w:pPr>
+            <w:r/>
             <w:r>
               <w:rPr>
                 <w:rFonts w:ascii="Calibri" w:hAnsi="Calibri"/>
@@ -1729,34 +1505,17 @@
         </w:tc>
         <w:tc>
           <w:tcPr>
-            <w:tcW w:type="dxa" w:w="737"/>
+            <w:tcW w:type="dxa" w:w="1020"/>
           </w:tcPr>
           <w:p>
             <w:pPr>
               <w:jc w:val="center"/>
             </w:pPr>
+            <w:r/>
             <w:r>
               <w:rPr>
                 <w:rFonts w:ascii="Calibri" w:hAnsi="Calibri"/>
-                <w:sz w:val="18"/>
-              </w:rPr>
-              <w:t>MUST</w:t>
-            </w:r>
-          </w:p>
-        </w:tc>
-        <w:tc>
-          <w:tcPr>
-            <w:tcW w:type="dxa" w:w="850"/>
-          </w:tcPr>
-          <w:p>
-            <w:pPr>
-              <w:jc w:val="center"/>
-            </w:pPr>
-            <w:r>
-              <w:rPr>
-                <w:rFonts w:ascii="Calibri" w:hAnsi="Calibri"/>
-                <w:b/>
-                <w:color w:val="008000"/>
+                <w:color w:val="228B22"/>
                 <w:sz w:val="18"/>
               </w:rPr>
               <w:t>Fully Met</w:t>
@@ -1765,12 +1524,13 @@
         </w:tc>
         <w:tc>
           <w:tcPr>
-            <w:tcW w:type="dxa" w:w="964"/>
+            <w:tcW w:type="dxa" w:w="1020"/>
           </w:tcPr>
           <w:p>
             <w:pPr>
               <w:jc w:val="center"/>
             </w:pPr>
+            <w:r/>
             <w:r>
               <w:rPr>
                 <w:rFonts w:ascii="Calibri" w:hAnsi="Calibri"/>
@@ -1782,15 +1542,16 @@
         </w:tc>
         <w:tc>
           <w:tcPr>
-            <w:tcW w:type="dxa" w:w="4535"/>
+            <w:tcW w:type="dxa" w:w="4819"/>
           </w:tcPr>
           <w:p>
+            <w:r/>
             <w:r>
               <w:rPr>
                 <w:rFonts w:ascii="Calibri" w:hAnsi="Calibri"/>
                 <w:sz w:val="18"/>
               </w:rPr>
-              <w:t>The system states when requested data is not present in the uploaded log.</w:t>
+              <w:t>If the requested data is not present in the uploaded log, the system says so explicitly.</w:t>
             </w:r>
           </w:p>
         </w:tc>
@@ -1798,9 +1559,9 @@
       <w:tr>
         <w:tc>
           <w:tcPr>
-            <w:tcW w:type="dxa" w:w="4535"/>
-            <w:gridSpan w:val="6"/>
-            <w:shd w:fill="D6E4F0" w:val="clear"/>
+            <w:tcW w:type="dxa" w:w="9693"/>
+            <w:gridSpan w:val="5"/>
+            <w:shd w:fill="F2F2F2" w:val="clear"/>
           </w:tcPr>
           <w:p>
             <w:r/>
@@ -1813,32 +1574,18 @@
               <w:t>BR5 – Fault Code Explanation</w:t>
             </w:r>
           </w:p>
-          <w:p>
-            <w:r/>
-          </w:p>
-          <w:p>
-            <w:r/>
-          </w:p>
-          <w:p>
-            <w:r/>
-          </w:p>
-          <w:p>
-            <w:r/>
-          </w:p>
-          <w:p>
-            <w:r/>
-          </w:p>
         </w:tc>
       </w:tr>
       <w:tr>
         <w:tc>
           <w:tcPr>
-            <w:tcW w:type="dxa" w:w="737"/>
+            <w:tcW w:type="dxa" w:w="850"/>
           </w:tcPr>
           <w:p>
             <w:pPr>
               <w:jc w:val="center"/>
             </w:pPr>
+            <w:r/>
             <w:r>
               <w:rPr>
                 <w:rFonts w:ascii="Calibri" w:hAnsi="Calibri"/>
@@ -1850,9 +1597,13 @@
         </w:tc>
         <w:tc>
           <w:tcPr>
-            <w:tcW w:type="dxa" w:w="1814"/>
+            <w:tcW w:type="dxa" w:w="1984"/>
           </w:tcPr>
           <w:p>
+            <w:pPr>
+              <w:jc w:val="center"/>
+            </w:pPr>
+            <w:r/>
             <w:r>
               <w:rPr>
                 <w:rFonts w:ascii="Calibri" w:hAnsi="Calibri"/>
@@ -1864,34 +1615,17 @@
         </w:tc>
         <w:tc>
           <w:tcPr>
-            <w:tcW w:type="dxa" w:w="737"/>
+            <w:tcW w:type="dxa" w:w="1020"/>
           </w:tcPr>
           <w:p>
             <w:pPr>
               <w:jc w:val="center"/>
             </w:pPr>
+            <w:r/>
             <w:r>
               <w:rPr>
                 <w:rFonts w:ascii="Calibri" w:hAnsi="Calibri"/>
-                <w:sz w:val="18"/>
-              </w:rPr>
-              <w:t>MUST</w:t>
-            </w:r>
-          </w:p>
-        </w:tc>
-        <w:tc>
-          <w:tcPr>
-            <w:tcW w:type="dxa" w:w="850"/>
-          </w:tcPr>
-          <w:p>
-            <w:pPr>
-              <w:jc w:val="center"/>
-            </w:pPr>
-            <w:r>
-              <w:rPr>
-                <w:rFonts w:ascii="Calibri" w:hAnsi="Calibri"/>
-                <w:b/>
-                <w:color w:val="008000"/>
+                <w:color w:val="228B22"/>
                 <w:sz w:val="18"/>
               </w:rPr>
               <w:t>Fully Met</w:t>
@@ -1900,12 +1634,13 @@
         </w:tc>
         <w:tc>
           <w:tcPr>
-            <w:tcW w:type="dxa" w:w="964"/>
+            <w:tcW w:type="dxa" w:w="1020"/>
           </w:tcPr>
           <w:p>
             <w:pPr>
               <w:jc w:val="center"/>
             </w:pPr>
+            <w:r/>
             <w:r>
               <w:rPr>
                 <w:rFonts w:ascii="Calibri" w:hAnsi="Calibri"/>
@@ -1917,15 +1652,16 @@
         </w:tc>
         <w:tc>
           <w:tcPr>
-            <w:tcW w:type="dxa" w:w="4535"/>
+            <w:tcW w:type="dxa" w:w="4819"/>
           </w:tcPr>
           <w:p>
+            <w:r/>
             <w:r>
               <w:rPr>
                 <w:rFonts w:ascii="Calibri" w:hAnsi="Calibri"/>
                 <w:sz w:val="18"/>
               </w:rPr>
-              <w:t>Codes are looked up in our 185+ code database and explained via the RAG pipeline with descriptions, severity, and possible causes.</w:t>
+              <w:t>Codes are matched against our 185+ code database and explained through the RAG pipeline, covering description, severity, and likely causes.</w:t>
             </w:r>
           </w:p>
         </w:tc>
@@ -1933,12 +1669,13 @@
       <w:tr>
         <w:tc>
           <w:tcPr>
-            <w:tcW w:type="dxa" w:w="737"/>
+            <w:tcW w:type="dxa" w:w="850"/>
           </w:tcPr>
           <w:p>
             <w:pPr>
               <w:jc w:val="center"/>
             </w:pPr>
+            <w:r/>
             <w:r>
               <w:rPr>
                 <w:rFonts w:ascii="Calibri" w:hAnsi="Calibri"/>
@@ -1950,9 +1687,13 @@
         </w:tc>
         <w:tc>
           <w:tcPr>
-            <w:tcW w:type="dxa" w:w="1814"/>
+            <w:tcW w:type="dxa" w:w="1984"/>
           </w:tcPr>
           <w:p>
+            <w:pPr>
+              <w:jc w:val="center"/>
+            </w:pPr>
+            <w:r/>
             <w:r>
               <w:rPr>
                 <w:rFonts w:ascii="Calibri" w:hAnsi="Calibri"/>
@@ -1964,34 +1705,17 @@
         </w:tc>
         <w:tc>
           <w:tcPr>
-            <w:tcW w:type="dxa" w:w="737"/>
+            <w:tcW w:type="dxa" w:w="1020"/>
           </w:tcPr>
           <w:p>
             <w:pPr>
               <w:jc w:val="center"/>
             </w:pPr>
+            <w:r/>
             <w:r>
               <w:rPr>
                 <w:rFonts w:ascii="Calibri" w:hAnsi="Calibri"/>
-                <w:sz w:val="18"/>
-              </w:rPr>
-              <w:t>MUST</w:t>
-            </w:r>
-          </w:p>
-        </w:tc>
-        <w:tc>
-          <w:tcPr>
-            <w:tcW w:type="dxa" w:w="850"/>
-          </w:tcPr>
-          <w:p>
-            <w:pPr>
-              <w:jc w:val="center"/>
-            </w:pPr>
-            <w:r>
-              <w:rPr>
-                <w:rFonts w:ascii="Calibri" w:hAnsi="Calibri"/>
-                <w:b/>
-                <w:color w:val="008000"/>
+                <w:color w:val="228B22"/>
                 <w:sz w:val="18"/>
               </w:rPr>
               <w:t>Fully Met</w:t>
@@ -2000,12 +1724,13 @@
         </w:tc>
         <w:tc>
           <w:tcPr>
-            <w:tcW w:type="dxa" w:w="964"/>
+            <w:tcW w:type="dxa" w:w="1020"/>
           </w:tcPr>
           <w:p>
             <w:pPr>
               <w:jc w:val="center"/>
             </w:pPr>
+            <w:r/>
             <w:r>
               <w:rPr>
                 <w:rFonts w:ascii="Calibri" w:hAnsi="Calibri"/>
@@ -2017,15 +1742,16 @@
         </w:tc>
         <w:tc>
           <w:tcPr>
-            <w:tcW w:type="dxa" w:w="4535"/>
+            <w:tcW w:type="dxa" w:w="4819"/>
           </w:tcPr>
           <w:p>
+            <w:r/>
             <w:r>
               <w:rPr>
                 <w:rFonts w:ascii="Calibri" w:hAnsi="Calibri"/>
                 <w:sz w:val="18"/>
               </w:rPr>
-              <w:t>All detected fault codes are listed with their severity and descriptions.</w:t>
+              <w:t>Every detected fault code is listed alongside its severity and a brief description.</w:t>
             </w:r>
           </w:p>
         </w:tc>
@@ -2033,12 +1759,13 @@
       <w:tr>
         <w:tc>
           <w:tcPr>
-            <w:tcW w:type="dxa" w:w="737"/>
+            <w:tcW w:type="dxa" w:w="850"/>
           </w:tcPr>
           <w:p>
             <w:pPr>
               <w:jc w:val="center"/>
             </w:pPr>
+            <w:r/>
             <w:r>
               <w:rPr>
                 <w:rFonts w:ascii="Calibri" w:hAnsi="Calibri"/>
@@ -2050,9 +1777,13 @@
         </w:tc>
         <w:tc>
           <w:tcPr>
-            <w:tcW w:type="dxa" w:w="1814"/>
+            <w:tcW w:type="dxa" w:w="1984"/>
           </w:tcPr>
           <w:p>
+            <w:pPr>
+              <w:jc w:val="center"/>
+            </w:pPr>
+            <w:r/>
             <w:r>
               <w:rPr>
                 <w:rFonts w:ascii="Calibri" w:hAnsi="Calibri"/>
@@ -2064,34 +1795,17 @@
         </w:tc>
         <w:tc>
           <w:tcPr>
-            <w:tcW w:type="dxa" w:w="737"/>
+            <w:tcW w:type="dxa" w:w="1020"/>
           </w:tcPr>
           <w:p>
             <w:pPr>
               <w:jc w:val="center"/>
             </w:pPr>
+            <w:r/>
             <w:r>
               <w:rPr>
                 <w:rFonts w:ascii="Calibri" w:hAnsi="Calibri"/>
-                <w:sz w:val="18"/>
-              </w:rPr>
-              <w:t>MUST</w:t>
-            </w:r>
-          </w:p>
-        </w:tc>
-        <w:tc>
-          <w:tcPr>
-            <w:tcW w:type="dxa" w:w="850"/>
-          </w:tcPr>
-          <w:p>
-            <w:pPr>
-              <w:jc w:val="center"/>
-            </w:pPr>
-            <w:r>
-              <w:rPr>
-                <w:rFonts w:ascii="Calibri" w:hAnsi="Calibri"/>
-                <w:b/>
-                <w:color w:val="008000"/>
+                <w:color w:val="228B22"/>
                 <w:sz w:val="18"/>
               </w:rPr>
               <w:t>Fully Met</w:t>
@@ -2100,12 +1814,13 @@
         </w:tc>
         <w:tc>
           <w:tcPr>
-            <w:tcW w:type="dxa" w:w="964"/>
+            <w:tcW w:type="dxa" w:w="1020"/>
           </w:tcPr>
           <w:p>
             <w:pPr>
               <w:jc w:val="center"/>
             </w:pPr>
+            <w:r/>
             <w:r>
               <w:rPr>
                 <w:rFonts w:ascii="Calibri" w:hAnsi="Calibri"/>
@@ -2117,15 +1832,16 @@
         </w:tc>
         <w:tc>
           <w:tcPr>
-            <w:tcW w:type="dxa" w:w="4535"/>
+            <w:tcW w:type="dxa" w:w="4819"/>
           </w:tcPr>
           <w:p>
+            <w:r/>
             <w:r>
               <w:rPr>
                 <w:rFonts w:ascii="Calibri" w:hAnsi="Calibri"/>
                 <w:sz w:val="18"/>
               </w:rPr>
-              <w:t>Manufacturer-specific codes are identified. The system explains that only generic OBD-II codes are supported.</w:t>
+              <w:t>Manufacturer-specific codes are recognised but flagged as unsupported, with a note that only generic OBD-II codes can be interpreted.</w:t>
             </w:r>
           </w:p>
         </w:tc>
@@ -2133,12 +1849,13 @@
       <w:tr>
         <w:tc>
           <w:tcPr>
-            <w:tcW w:type="dxa" w:w="737"/>
+            <w:tcW w:type="dxa" w:w="850"/>
           </w:tcPr>
           <w:p>
             <w:pPr>
               <w:jc w:val="center"/>
             </w:pPr>
+            <w:r/>
             <w:r>
               <w:rPr>
                 <w:rFonts w:ascii="Calibri" w:hAnsi="Calibri"/>
@@ -2150,9 +1867,13 @@
         </w:tc>
         <w:tc>
           <w:tcPr>
-            <w:tcW w:type="dxa" w:w="1814"/>
+            <w:tcW w:type="dxa" w:w="1984"/>
           </w:tcPr>
           <w:p>
+            <w:pPr>
+              <w:jc w:val="center"/>
+            </w:pPr>
+            <w:r/>
             <w:r>
               <w:rPr>
                 <w:rFonts w:ascii="Calibri" w:hAnsi="Calibri"/>
@@ -2164,34 +1885,17 @@
         </w:tc>
         <w:tc>
           <w:tcPr>
-            <w:tcW w:type="dxa" w:w="737"/>
+            <w:tcW w:type="dxa" w:w="1020"/>
           </w:tcPr>
           <w:p>
             <w:pPr>
               <w:jc w:val="center"/>
             </w:pPr>
+            <w:r/>
             <w:r>
               <w:rPr>
                 <w:rFonts w:ascii="Calibri" w:hAnsi="Calibri"/>
-                <w:sz w:val="18"/>
-              </w:rPr>
-              <w:t>MUST</w:t>
-            </w:r>
-          </w:p>
-        </w:tc>
-        <w:tc>
-          <w:tcPr>
-            <w:tcW w:type="dxa" w:w="850"/>
-          </w:tcPr>
-          <w:p>
-            <w:pPr>
-              <w:jc w:val="center"/>
-            </w:pPr>
-            <w:r>
-              <w:rPr>
-                <w:rFonts w:ascii="Calibri" w:hAnsi="Calibri"/>
-                <w:b/>
-                <w:color w:val="008000"/>
+                <w:color w:val="228B22"/>
                 <w:sz w:val="18"/>
               </w:rPr>
               <w:t>Fully Met</w:t>
@@ -2200,12 +1904,13 @@
         </w:tc>
         <w:tc>
           <w:tcPr>
-            <w:tcW w:type="dxa" w:w="964"/>
+            <w:tcW w:type="dxa" w:w="1020"/>
           </w:tcPr>
           <w:p>
             <w:pPr>
               <w:jc w:val="center"/>
             </w:pPr>
+            <w:r/>
             <w:r>
               <w:rPr>
                 <w:rFonts w:ascii="Calibri" w:hAnsi="Calibri"/>
@@ -2217,15 +1922,16 @@
         </w:tc>
         <w:tc>
           <w:tcPr>
-            <w:tcW w:type="dxa" w:w="4535"/>
+            <w:tcW w:type="dxa" w:w="4819"/>
           </w:tcPr>
           <w:p>
+            <w:r/>
             <w:r>
               <w:rPr>
                 <w:rFonts w:ascii="Calibri" w:hAnsi="Calibri"/>
                 <w:sz w:val="18"/>
               </w:rPr>
-              <w:t>Provides positive reassurance and recommends continued regular maintenance.</w:t>
+              <w:t>The system confirms no faults were found and suggests continuing with routine maintenance.</w:t>
             </w:r>
           </w:p>
         </w:tc>
@@ -2233,9 +1939,9 @@
       <w:tr>
         <w:tc>
           <w:tcPr>
-            <w:tcW w:type="dxa" w:w="4535"/>
-            <w:gridSpan w:val="6"/>
-            <w:shd w:fill="D6E4F0" w:val="clear"/>
+            <w:tcW w:type="dxa" w:w="9693"/>
+            <w:gridSpan w:val="5"/>
+            <w:shd w:fill="F2F2F2" w:val="clear"/>
           </w:tcPr>
           <w:p>
             <w:r/>
@@ -2248,32 +1954,18 @@
               <w:t>BR6 – Speech-to-Text Dictation</w:t>
             </w:r>
           </w:p>
-          <w:p>
-            <w:r/>
-          </w:p>
-          <w:p>
-            <w:r/>
-          </w:p>
-          <w:p>
-            <w:r/>
-          </w:p>
-          <w:p>
-            <w:r/>
-          </w:p>
-          <w:p>
-            <w:r/>
-          </w:p>
         </w:tc>
       </w:tr>
       <w:tr>
         <w:tc>
           <w:tcPr>
-            <w:tcW w:type="dxa" w:w="737"/>
+            <w:tcW w:type="dxa" w:w="850"/>
           </w:tcPr>
           <w:p>
             <w:pPr>
               <w:jc w:val="center"/>
             </w:pPr>
+            <w:r/>
             <w:r>
               <w:rPr>
                 <w:rFonts w:ascii="Calibri" w:hAnsi="Calibri"/>
@@ -2285,9 +1977,13 @@
         </w:tc>
         <w:tc>
           <w:tcPr>
-            <w:tcW w:type="dxa" w:w="1814"/>
+            <w:tcW w:type="dxa" w:w="1984"/>
           </w:tcPr>
           <w:p>
+            <w:pPr>
+              <w:jc w:val="center"/>
+            </w:pPr>
+            <w:r/>
             <w:r>
               <w:rPr>
                 <w:rFonts w:ascii="Calibri" w:hAnsi="Calibri"/>
@@ -2299,34 +1995,17 @@
         </w:tc>
         <w:tc>
           <w:tcPr>
-            <w:tcW w:type="dxa" w:w="737"/>
+            <w:tcW w:type="dxa" w:w="1020"/>
           </w:tcPr>
           <w:p>
             <w:pPr>
               <w:jc w:val="center"/>
             </w:pPr>
+            <w:r/>
             <w:r>
               <w:rPr>
                 <w:rFonts w:ascii="Calibri" w:hAnsi="Calibri"/>
-                <w:sz w:val="18"/>
-              </w:rPr>
-              <w:t>SHOULD</w:t>
-            </w:r>
-          </w:p>
-        </w:tc>
-        <w:tc>
-          <w:tcPr>
-            <w:tcW w:type="dxa" w:w="850"/>
-          </w:tcPr>
-          <w:p>
-            <w:pPr>
-              <w:jc w:val="center"/>
-            </w:pPr>
-            <w:r>
-              <w:rPr>
-                <w:rFonts w:ascii="Calibri" w:hAnsi="Calibri"/>
-                <w:b/>
-                <w:color w:val="008000"/>
+                <w:color w:val="228B22"/>
                 <w:sz w:val="18"/>
               </w:rPr>
               <w:t>Fully Met</w:t>
@@ -2335,12 +2014,13 @@
         </w:tc>
         <w:tc>
           <w:tcPr>
-            <w:tcW w:type="dxa" w:w="964"/>
+            <w:tcW w:type="dxa" w:w="1020"/>
           </w:tcPr>
           <w:p>
             <w:pPr>
               <w:jc w:val="center"/>
             </w:pPr>
+            <w:r/>
             <w:r>
               <w:rPr>
                 <w:rFonts w:ascii="Calibri" w:hAnsi="Calibri"/>
@@ -2352,15 +2032,16 @@
         </w:tc>
         <w:tc>
           <w:tcPr>
-            <w:tcW w:type="dxa" w:w="4535"/>
+            <w:tcW w:type="dxa" w:w="4819"/>
           </w:tcPr>
           <w:p>
+            <w:r/>
             <w:r>
               <w:rPr>
                 <w:rFonts w:ascii="Calibri" w:hAnsi="Calibri"/>
                 <w:sz w:val="18"/>
               </w:rPr>
-              <w:t>Uses faster-whisper (local Whisper) instead of IBM Granite STT. We made this switch so everything runs offline and no voice data leaves the user's machine.</w:t>
+              <w:t>Uses faster-whisper (a local Whisper implementation) rather than IBM Granite STT, so that all processing stays offline and no voice data leaves the machine.</w:t>
             </w:r>
           </w:p>
         </w:tc>
@@ -2368,12 +2049,13 @@
       <w:tr>
         <w:tc>
           <w:tcPr>
-            <w:tcW w:type="dxa" w:w="737"/>
+            <w:tcW w:type="dxa" w:w="850"/>
           </w:tcPr>
           <w:p>
             <w:pPr>
               <w:jc w:val="center"/>
             </w:pPr>
+            <w:r/>
             <w:r>
               <w:rPr>
                 <w:rFonts w:ascii="Calibri" w:hAnsi="Calibri"/>
@@ -2385,9 +2067,13 @@
         </w:tc>
         <w:tc>
           <w:tcPr>
-            <w:tcW w:type="dxa" w:w="1814"/>
+            <w:tcW w:type="dxa" w:w="1984"/>
           </w:tcPr>
           <w:p>
+            <w:pPr>
+              <w:jc w:val="center"/>
+            </w:pPr>
+            <w:r/>
             <w:r>
               <w:rPr>
                 <w:rFonts w:ascii="Calibri" w:hAnsi="Calibri"/>
@@ -2399,34 +2085,17 @@
         </w:tc>
         <w:tc>
           <w:tcPr>
-            <w:tcW w:type="dxa" w:w="737"/>
+            <w:tcW w:type="dxa" w:w="1020"/>
           </w:tcPr>
           <w:p>
             <w:pPr>
               <w:jc w:val="center"/>
             </w:pPr>
+            <w:r/>
             <w:r>
               <w:rPr>
                 <w:rFonts w:ascii="Calibri" w:hAnsi="Calibri"/>
-                <w:sz w:val="18"/>
-              </w:rPr>
-              <w:t>SHOULD</w:t>
-            </w:r>
-          </w:p>
-        </w:tc>
-        <w:tc>
-          <w:tcPr>
-            <w:tcW w:type="dxa" w:w="850"/>
-          </w:tcPr>
-          <w:p>
-            <w:pPr>
-              <w:jc w:val="center"/>
-            </w:pPr>
-            <w:r>
-              <w:rPr>
-                <w:rFonts w:ascii="Calibri" w:hAnsi="Calibri"/>
-                <w:b/>
-                <w:color w:val="C00000"/>
+                <w:color w:val="CC0000"/>
                 <w:sz w:val="18"/>
               </w:rPr>
               <w:t>Not Met</w:t>
@@ -2435,12 +2104,13 @@
         </w:tc>
         <w:tc>
           <w:tcPr>
-            <w:tcW w:type="dxa" w:w="964"/>
+            <w:tcW w:type="dxa" w:w="1020"/>
           </w:tcPr>
           <w:p>
             <w:pPr>
               <w:jc w:val="center"/>
             </w:pPr>
+            <w:r/>
             <w:r>
               <w:rPr>
                 <w:rFonts w:ascii="Calibri" w:hAnsi="Calibri"/>
@@ -2452,15 +2122,16 @@
         </w:tc>
         <w:tc>
           <w:tcPr>
-            <w:tcW w:type="dxa" w:w="4535"/>
+            <w:tcW w:type="dxa" w:w="4819"/>
           </w:tcPr>
           <w:p>
+            <w:r/>
             <w:r>
               <w:rPr>
                 <w:rFonts w:ascii="Calibri" w:hAnsi="Calibri"/>
                 <w:sz w:val="18"/>
               </w:rPr>
-              <w:t>Dictated text is appended to the end of the input box rather than inserted at the cursor. We prioritised getting the core voice pipeline working over this refinement.</w:t>
+              <w:t>Dictated text is appended to the end of the input field rather than inserted at the cursor. We chose to focus on getting the core voice pipeline stable first.</w:t>
             </w:r>
           </w:p>
         </w:tc>
@@ -2468,12 +2139,13 @@
       <w:tr>
         <w:tc>
           <w:tcPr>
-            <w:tcW w:type="dxa" w:w="737"/>
+            <w:tcW w:type="dxa" w:w="850"/>
           </w:tcPr>
           <w:p>
             <w:pPr>
               <w:jc w:val="center"/>
             </w:pPr>
+            <w:r/>
             <w:r>
               <w:rPr>
                 <w:rFonts w:ascii="Calibri" w:hAnsi="Calibri"/>
@@ -2485,9 +2157,13 @@
         </w:tc>
         <w:tc>
           <w:tcPr>
-            <w:tcW w:type="dxa" w:w="1814"/>
+            <w:tcW w:type="dxa" w:w="1984"/>
           </w:tcPr>
           <w:p>
+            <w:pPr>
+              <w:jc w:val="center"/>
+            </w:pPr>
+            <w:r/>
             <w:r>
               <w:rPr>
                 <w:rFonts w:ascii="Calibri" w:hAnsi="Calibri"/>
@@ -2499,34 +2175,17 @@
         </w:tc>
         <w:tc>
           <w:tcPr>
-            <w:tcW w:type="dxa" w:w="737"/>
+            <w:tcW w:type="dxa" w:w="1020"/>
           </w:tcPr>
           <w:p>
             <w:pPr>
               <w:jc w:val="center"/>
             </w:pPr>
+            <w:r/>
             <w:r>
               <w:rPr>
                 <w:rFonts w:ascii="Calibri" w:hAnsi="Calibri"/>
-                <w:sz w:val="18"/>
-              </w:rPr>
-              <w:t>SHOULD</w:t>
-            </w:r>
-          </w:p>
-        </w:tc>
-        <w:tc>
-          <w:tcPr>
-            <w:tcW w:type="dxa" w:w="850"/>
-          </w:tcPr>
-          <w:p>
-            <w:pPr>
-              <w:jc w:val="center"/>
-            </w:pPr>
-            <w:r>
-              <w:rPr>
-                <w:rFonts w:ascii="Calibri" w:hAnsi="Calibri"/>
-                <w:b/>
-                <w:color w:val="008000"/>
+                <w:color w:val="228B22"/>
                 <w:sz w:val="18"/>
               </w:rPr>
               <w:t>Fully Met</w:t>
@@ -2535,12 +2194,13 @@
         </w:tc>
         <w:tc>
           <w:tcPr>
-            <w:tcW w:type="dxa" w:w="964"/>
+            <w:tcW w:type="dxa" w:w="1020"/>
           </w:tcPr>
           <w:p>
             <w:pPr>
               <w:jc w:val="center"/>
             </w:pPr>
+            <w:r/>
             <w:r>
               <w:rPr>
                 <w:rFonts w:ascii="Calibri" w:hAnsi="Calibri"/>
@@ -2552,15 +2212,16 @@
         </w:tc>
         <w:tc>
           <w:tcPr>
-            <w:tcW w:type="dxa" w:w="4535"/>
+            <w:tcW w:type="dxa" w:w="4819"/>
           </w:tcPr>
           <w:p>
+            <w:r/>
             <w:r>
               <w:rPr>
                 <w:rFonts w:ascii="Calibri" w:hAnsi="Calibri"/>
                 <w:sz w:val="18"/>
               </w:rPr>
-              <w:t>Auto-stop triggers after 2 seconds of silence instead of 3. We lowered this after testing showed 3 seconds felt unresponsive.</w:t>
+              <w:t>Recording stops after 2 seconds of silence rather than the originally specified 3. Testing showed that 3 seconds felt sluggish.</w:t>
             </w:r>
           </w:p>
         </w:tc>
@@ -2568,12 +2229,13 @@
       <w:tr>
         <w:tc>
           <w:tcPr>
-            <w:tcW w:type="dxa" w:w="737"/>
+            <w:tcW w:type="dxa" w:w="850"/>
           </w:tcPr>
           <w:p>
             <w:pPr>
               <w:jc w:val="center"/>
             </w:pPr>
+            <w:r/>
             <w:r>
               <w:rPr>
                 <w:rFonts w:ascii="Calibri" w:hAnsi="Calibri"/>
@@ -2585,9 +2247,13 @@
         </w:tc>
         <w:tc>
           <w:tcPr>
-            <w:tcW w:type="dxa" w:w="1814"/>
+            <w:tcW w:type="dxa" w:w="1984"/>
           </w:tcPr>
           <w:p>
+            <w:pPr>
+              <w:jc w:val="center"/>
+            </w:pPr>
+            <w:r/>
             <w:r>
               <w:rPr>
                 <w:rFonts w:ascii="Calibri" w:hAnsi="Calibri"/>
@@ -2599,34 +2265,17 @@
         </w:tc>
         <w:tc>
           <w:tcPr>
-            <w:tcW w:type="dxa" w:w="737"/>
+            <w:tcW w:type="dxa" w:w="1020"/>
           </w:tcPr>
           <w:p>
             <w:pPr>
               <w:jc w:val="center"/>
             </w:pPr>
+            <w:r/>
             <w:r>
               <w:rPr>
                 <w:rFonts w:ascii="Calibri" w:hAnsi="Calibri"/>
-                <w:sz w:val="18"/>
-              </w:rPr>
-              <w:t>SHOULD</w:t>
-            </w:r>
-          </w:p>
-        </w:tc>
-        <w:tc>
-          <w:tcPr>
-            <w:tcW w:type="dxa" w:w="850"/>
-          </w:tcPr>
-          <w:p>
-            <w:pPr>
-              <w:jc w:val="center"/>
-            </w:pPr>
-            <w:r>
-              <w:rPr>
-                <w:rFonts w:ascii="Calibri" w:hAnsi="Calibri"/>
-                <w:b/>
-                <w:color w:val="008000"/>
+                <w:color w:val="228B22"/>
                 <w:sz w:val="18"/>
               </w:rPr>
               <w:t>Fully Met</w:t>
@@ -2635,12 +2284,13 @@
         </w:tc>
         <w:tc>
           <w:tcPr>
-            <w:tcW w:type="dxa" w:w="964"/>
+            <w:tcW w:type="dxa" w:w="1020"/>
           </w:tcPr>
           <w:p>
             <w:pPr>
               <w:jc w:val="center"/>
             </w:pPr>
+            <w:r/>
             <w:r>
               <w:rPr>
                 <w:rFonts w:ascii="Calibri" w:hAnsi="Calibri"/>
@@ -2652,15 +2302,16 @@
         </w:tc>
         <w:tc>
           <w:tcPr>
-            <w:tcW w:type="dxa" w:w="4535"/>
+            <w:tcW w:type="dxa" w:w="4819"/>
           </w:tcPr>
           <w:p>
+            <w:r/>
             <w:r>
               <w:rPr>
                 <w:rFonts w:ascii="Calibri" w:hAnsi="Calibri"/>
                 <w:sz w:val="18"/>
               </w:rPr>
-              <w:t>Checks device availability on start and shows an actionable error if mic access is denied.</w:t>
+              <w:t>Microphone availability is checked at startup. If access is denied, the user sees an actionable error message.</w:t>
             </w:r>
           </w:p>
         </w:tc>
@@ -2668,9 +2319,9 @@
       <w:tr>
         <w:tc>
           <w:tcPr>
-            <w:tcW w:type="dxa" w:w="4535"/>
-            <w:gridSpan w:val="6"/>
-            <w:shd w:fill="D6E4F0" w:val="clear"/>
+            <w:tcW w:type="dxa" w:w="9693"/>
+            <w:gridSpan w:val="5"/>
+            <w:shd w:fill="F2F2F2" w:val="clear"/>
           </w:tcPr>
           <w:p>
             <w:r/>
@@ -2683,32 +2334,18 @@
               <w:t>BR7 – Voice Conversation Mode</w:t>
             </w:r>
           </w:p>
-          <w:p>
-            <w:r/>
-          </w:p>
-          <w:p>
-            <w:r/>
-          </w:p>
-          <w:p>
-            <w:r/>
-          </w:p>
-          <w:p>
-            <w:r/>
-          </w:p>
-          <w:p>
-            <w:r/>
-          </w:p>
         </w:tc>
       </w:tr>
       <w:tr>
         <w:tc>
           <w:tcPr>
-            <w:tcW w:type="dxa" w:w="737"/>
+            <w:tcW w:type="dxa" w:w="850"/>
           </w:tcPr>
           <w:p>
             <w:pPr>
               <w:jc w:val="center"/>
             </w:pPr>
+            <w:r/>
             <w:r>
               <w:rPr>
                 <w:rFonts w:ascii="Calibri" w:hAnsi="Calibri"/>
@@ -2720,9 +2357,13 @@
         </w:tc>
         <w:tc>
           <w:tcPr>
-            <w:tcW w:type="dxa" w:w="1814"/>
+            <w:tcW w:type="dxa" w:w="1984"/>
           </w:tcPr>
           <w:p>
+            <w:pPr>
+              <w:jc w:val="center"/>
+            </w:pPr>
+            <w:r/>
             <w:r>
               <w:rPr>
                 <w:rFonts w:ascii="Calibri" w:hAnsi="Calibri"/>
@@ -2734,34 +2375,17 @@
         </w:tc>
         <w:tc>
           <w:tcPr>
-            <w:tcW w:type="dxa" w:w="737"/>
+            <w:tcW w:type="dxa" w:w="1020"/>
           </w:tcPr>
           <w:p>
             <w:pPr>
               <w:jc w:val="center"/>
             </w:pPr>
+            <w:r/>
             <w:r>
               <w:rPr>
                 <w:rFonts w:ascii="Calibri" w:hAnsi="Calibri"/>
-                <w:sz w:val="18"/>
-              </w:rPr>
-              <w:t>SHOULD</w:t>
-            </w:r>
-          </w:p>
-        </w:tc>
-        <w:tc>
-          <w:tcPr>
-            <w:tcW w:type="dxa" w:w="850"/>
-          </w:tcPr>
-          <w:p>
-            <w:pPr>
-              <w:jc w:val="center"/>
-            </w:pPr>
-            <w:r>
-              <w:rPr>
-                <w:rFonts w:ascii="Calibri" w:hAnsi="Calibri"/>
-                <w:b/>
-                <w:color w:val="008000"/>
+                <w:color w:val="228B22"/>
                 <w:sz w:val="18"/>
               </w:rPr>
               <w:t>Fully Met</w:t>
@@ -2770,12 +2394,13 @@
         </w:tc>
         <w:tc>
           <w:tcPr>
-            <w:tcW w:type="dxa" w:w="964"/>
+            <w:tcW w:type="dxa" w:w="1020"/>
           </w:tcPr>
           <w:p>
             <w:pPr>
               <w:jc w:val="center"/>
             </w:pPr>
+            <w:r/>
             <w:r>
               <w:rPr>
                 <w:rFonts w:ascii="Calibri" w:hAnsi="Calibri"/>
@@ -2787,15 +2412,16 @@
         </w:tc>
         <w:tc>
           <w:tcPr>
-            <w:tcW w:type="dxa" w:w="4535"/>
+            <w:tcW w:type="dxa" w:w="4819"/>
           </w:tcPr>
           <w:p>
+            <w:r/>
             <w:r>
               <w:rPr>
                 <w:rFonts w:ascii="Calibri" w:hAnsi="Calibri"/>
                 <w:sz w:val="18"/>
               </w:rPr>
-              <w:t>Full pipeline: mic capture via faster-whisper, AI response via Granite, spoken reply via edge-tts with Microsoft neural voices.</w:t>
+              <w:t>End-to-end pipeline: microphone input is transcribed via faster-whisper, processed by Granite, and read back using edge-tts with Microsoft neural voices.</w:t>
             </w:r>
           </w:p>
         </w:tc>
@@ -2803,12 +2429,13 @@
       <w:tr>
         <w:tc>
           <w:tcPr>
-            <w:tcW w:type="dxa" w:w="737"/>
+            <w:tcW w:type="dxa" w:w="850"/>
           </w:tcPr>
           <w:p>
             <w:pPr>
               <w:jc w:val="center"/>
             </w:pPr>
+            <w:r/>
             <w:r>
               <w:rPr>
                 <w:rFonts w:ascii="Calibri" w:hAnsi="Calibri"/>
@@ -2820,9 +2447,13 @@
         </w:tc>
         <w:tc>
           <w:tcPr>
-            <w:tcW w:type="dxa" w:w="1814"/>
+            <w:tcW w:type="dxa" w:w="1984"/>
           </w:tcPr>
           <w:p>
+            <w:pPr>
+              <w:jc w:val="center"/>
+            </w:pPr>
+            <w:r/>
             <w:r>
               <w:rPr>
                 <w:rFonts w:ascii="Calibri" w:hAnsi="Calibri"/>
@@ -2834,34 +2465,17 @@
         </w:tc>
         <w:tc>
           <w:tcPr>
-            <w:tcW w:type="dxa" w:w="737"/>
+            <w:tcW w:type="dxa" w:w="1020"/>
           </w:tcPr>
           <w:p>
             <w:pPr>
               <w:jc w:val="center"/>
             </w:pPr>
+            <w:r/>
             <w:r>
               <w:rPr>
                 <w:rFonts w:ascii="Calibri" w:hAnsi="Calibri"/>
-                <w:sz w:val="18"/>
-              </w:rPr>
-              <w:t>SHOULD</w:t>
-            </w:r>
-          </w:p>
-        </w:tc>
-        <w:tc>
-          <w:tcPr>
-            <w:tcW w:type="dxa" w:w="850"/>
-          </w:tcPr>
-          <w:p>
-            <w:pPr>
-              <w:jc w:val="center"/>
-            </w:pPr>
-            <w:r>
-              <w:rPr>
-                <w:rFonts w:ascii="Calibri" w:hAnsi="Calibri"/>
-                <w:b/>
-                <w:color w:val="008000"/>
+                <w:color w:val="228B22"/>
                 <w:sz w:val="18"/>
               </w:rPr>
               <w:t>Fully Met</w:t>
@@ -2870,12 +2484,13 @@
         </w:tc>
         <w:tc>
           <w:tcPr>
-            <w:tcW w:type="dxa" w:w="964"/>
+            <w:tcW w:type="dxa" w:w="1020"/>
           </w:tcPr>
           <w:p>
             <w:pPr>
               <w:jc w:val="center"/>
             </w:pPr>
+            <w:r/>
             <w:r>
               <w:rPr>
                 <w:rFonts w:ascii="Calibri" w:hAnsi="Calibri"/>
@@ -2887,15 +2502,16 @@
         </w:tc>
         <w:tc>
           <w:tcPr>
-            <w:tcW w:type="dxa" w:w="4535"/>
+            <w:tcW w:type="dxa" w:w="4819"/>
           </w:tcPr>
           <w:p>
+            <w:r/>
             <w:r>
               <w:rPr>
                 <w:rFonts w:ascii="Calibri" w:hAnsi="Calibri"/>
                 <w:sz w:val="18"/>
               </w:rPr>
-              <w:t>Same 2-second silence threshold as BR6.3. We added a half-duplex protocol to stop the mic picking up the TTS playback, which would otherwise cause a feedback loop.</w:t>
+              <w:t>Uses the same 2-second silence threshold as BR6.3. A half-duplex protocol prevents the microphone from picking up TTS playback, which would otherwise cause feedback.</w:t>
             </w:r>
           </w:p>
         </w:tc>
@@ -2903,12 +2519,13 @@
       <w:tr>
         <w:tc>
           <w:tcPr>
-            <w:tcW w:type="dxa" w:w="737"/>
+            <w:tcW w:type="dxa" w:w="850"/>
           </w:tcPr>
           <w:p>
             <w:pPr>
               <w:jc w:val="center"/>
             </w:pPr>
+            <w:r/>
             <w:r>
               <w:rPr>
                 <w:rFonts w:ascii="Calibri" w:hAnsi="Calibri"/>
@@ -2920,9 +2537,13 @@
         </w:tc>
         <w:tc>
           <w:tcPr>
-            <w:tcW w:type="dxa" w:w="1814"/>
+            <w:tcW w:type="dxa" w:w="1984"/>
           </w:tcPr>
           <w:p>
+            <w:pPr>
+              <w:jc w:val="center"/>
+            </w:pPr>
+            <w:r/>
             <w:r>
               <w:rPr>
                 <w:rFonts w:ascii="Calibri" w:hAnsi="Calibri"/>
@@ -2934,34 +2555,17 @@
         </w:tc>
         <w:tc>
           <w:tcPr>
-            <w:tcW w:type="dxa" w:w="737"/>
+            <w:tcW w:type="dxa" w:w="1020"/>
           </w:tcPr>
           <w:p>
             <w:pPr>
               <w:jc w:val="center"/>
             </w:pPr>
+            <w:r/>
             <w:r>
               <w:rPr>
                 <w:rFonts w:ascii="Calibri" w:hAnsi="Calibri"/>
-                <w:sz w:val="18"/>
-              </w:rPr>
-              <w:t>SHOULD</w:t>
-            </w:r>
-          </w:p>
-        </w:tc>
-        <w:tc>
-          <w:tcPr>
-            <w:tcW w:type="dxa" w:w="850"/>
-          </w:tcPr>
-          <w:p>
-            <w:pPr>
-              <w:jc w:val="center"/>
-            </w:pPr>
-            <w:r>
-              <w:rPr>
-                <w:rFonts w:ascii="Calibri" w:hAnsi="Calibri"/>
-                <w:b/>
-                <w:color w:val="C00000"/>
+                <w:color w:val="CC0000"/>
                 <w:sz w:val="18"/>
               </w:rPr>
               <w:t>Not Met</w:t>
@@ -2970,12 +2574,13 @@
         </w:tc>
         <w:tc>
           <w:tcPr>
-            <w:tcW w:type="dxa" w:w="964"/>
+            <w:tcW w:type="dxa" w:w="1020"/>
           </w:tcPr>
           <w:p>
             <w:pPr>
               <w:jc w:val="center"/>
             </w:pPr>
+            <w:r/>
             <w:r>
               <w:rPr>
                 <w:rFonts w:ascii="Calibri" w:hAnsi="Calibri"/>
@@ -2987,15 +2592,16 @@
         </w:tc>
         <w:tc>
           <w:tcPr>
-            <w:tcW w:type="dxa" w:w="4535"/>
+            <w:tcW w:type="dxa" w:w="4819"/>
           </w:tcPr>
           <w:p>
+            <w:r/>
             <w:r>
               <w:rPr>
                 <w:rFonts w:ascii="Calibri" w:hAnsi="Calibri"/>
                 <w:sz w:val="18"/>
               </w:rPr>
-              <w:t>Not implemented. We use a button press instead. Wake word detection would require an always-on mic listener, conflicting with our privacy-first approach and increasing background resource usage.</w:t>
+              <w:t>Not implemented. A button press is used instead. Wake word detection would need an always-on microphone listener, which conflicts with the privacy-first design and raises resource usage.</w:t>
             </w:r>
           </w:p>
         </w:tc>
@@ -3003,9 +2609,9 @@
       <w:tr>
         <w:tc>
           <w:tcPr>
-            <w:tcW w:type="dxa" w:w="4535"/>
-            <w:gridSpan w:val="6"/>
-            <w:shd w:fill="D6E4F0" w:val="clear"/>
+            <w:tcW w:type="dxa" w:w="9693"/>
+            <w:gridSpan w:val="5"/>
+            <w:shd w:fill="F2F2F2" w:val="clear"/>
           </w:tcPr>
           <w:p>
             <w:r/>
@@ -3018,32 +2624,18 @@
               <w:t>BR8 – Danger Level Categorisation</w:t>
             </w:r>
           </w:p>
-          <w:p>
-            <w:r/>
-          </w:p>
-          <w:p>
-            <w:r/>
-          </w:p>
-          <w:p>
-            <w:r/>
-          </w:p>
-          <w:p>
-            <w:r/>
-          </w:p>
-          <w:p>
-            <w:r/>
-          </w:p>
         </w:tc>
       </w:tr>
       <w:tr>
         <w:tc>
           <w:tcPr>
-            <w:tcW w:type="dxa" w:w="737"/>
+            <w:tcW w:type="dxa" w:w="850"/>
           </w:tcPr>
           <w:p>
             <w:pPr>
               <w:jc w:val="center"/>
             </w:pPr>
+            <w:r/>
             <w:r>
               <w:rPr>
                 <w:rFonts w:ascii="Calibri" w:hAnsi="Calibri"/>
@@ -3055,9 +2647,13 @@
         </w:tc>
         <w:tc>
           <w:tcPr>
-            <w:tcW w:type="dxa" w:w="1814"/>
+            <w:tcW w:type="dxa" w:w="1984"/>
           </w:tcPr>
           <w:p>
+            <w:pPr>
+              <w:jc w:val="center"/>
+            </w:pPr>
+            <w:r/>
             <w:r>
               <w:rPr>
                 <w:rFonts w:ascii="Calibri" w:hAnsi="Calibri"/>
@@ -3069,34 +2665,17 @@
         </w:tc>
         <w:tc>
           <w:tcPr>
-            <w:tcW w:type="dxa" w:w="737"/>
+            <w:tcW w:type="dxa" w:w="1020"/>
           </w:tcPr>
           <w:p>
             <w:pPr>
               <w:jc w:val="center"/>
             </w:pPr>
+            <w:r/>
             <w:r>
               <w:rPr>
                 <w:rFonts w:ascii="Calibri" w:hAnsi="Calibri"/>
-                <w:sz w:val="18"/>
-              </w:rPr>
-              <w:t>SHOULD</w:t>
-            </w:r>
-          </w:p>
-        </w:tc>
-        <w:tc>
-          <w:tcPr>
-            <w:tcW w:type="dxa" w:w="850"/>
-          </w:tcPr>
-          <w:p>
-            <w:pPr>
-              <w:jc w:val="center"/>
-            </w:pPr>
-            <w:r>
-              <w:rPr>
-                <w:rFonts w:ascii="Calibri" w:hAnsi="Calibri"/>
-                <w:b/>
-                <w:color w:val="008000"/>
+                <w:color w:val="228B22"/>
                 <w:sz w:val="18"/>
               </w:rPr>
               <w:t>Fully Met</w:t>
@@ -3105,12 +2684,13 @@
         </w:tc>
         <w:tc>
           <w:tcPr>
-            <w:tcW w:type="dxa" w:w="964"/>
+            <w:tcW w:type="dxa" w:w="1020"/>
           </w:tcPr>
           <w:p>
             <w:pPr>
               <w:jc w:val="center"/>
             </w:pPr>
+            <w:r/>
             <w:r>
               <w:rPr>
                 <w:rFonts w:ascii="Calibri" w:hAnsi="Calibri"/>
@@ -3122,15 +2702,16 @@
         </w:tc>
         <w:tc>
           <w:tcPr>
-            <w:tcW w:type="dxa" w:w="4535"/>
+            <w:tcW w:type="dxa" w:w="4819"/>
           </w:tcPr>
           <w:p>
+            <w:r/>
             <w:r>
               <w:rPr>
                 <w:rFonts w:ascii="Calibri" w:hAnsi="Calibri"/>
                 <w:sz w:val="18"/>
               </w:rPr>
-              <w:t>SeverityClassifier uses keyword analysis, fault code prefix matching (e.g. P03xx misfire codes), and metric thresholds. Messages display red styling with a "Critical" badge.</w:t>
+              <w:t>SeverityClassifier applies keyword analysis, fault code prefix matching (e.g. P03xx misfire codes), and metric thresholds. Critical messages are styled in red with a "Critical" badge.</w:t>
             </w:r>
           </w:p>
         </w:tc>
@@ -3138,12 +2719,13 @@
       <w:tr>
         <w:tc>
           <w:tcPr>
-            <w:tcW w:type="dxa" w:w="737"/>
+            <w:tcW w:type="dxa" w:w="850"/>
           </w:tcPr>
           <w:p>
             <w:pPr>
               <w:jc w:val="center"/>
             </w:pPr>
+            <w:r/>
             <w:r>
               <w:rPr>
                 <w:rFonts w:ascii="Calibri" w:hAnsi="Calibri"/>
@@ -3155,9 +2737,13 @@
         </w:tc>
         <w:tc>
           <w:tcPr>
-            <w:tcW w:type="dxa" w:w="1814"/>
+            <w:tcW w:type="dxa" w:w="1984"/>
           </w:tcPr>
           <w:p>
+            <w:pPr>
+              <w:jc w:val="center"/>
+            </w:pPr>
+            <w:r/>
             <w:r>
               <w:rPr>
                 <w:rFonts w:ascii="Calibri" w:hAnsi="Calibri"/>
@@ -3169,34 +2755,17 @@
         </w:tc>
         <w:tc>
           <w:tcPr>
-            <w:tcW w:type="dxa" w:w="737"/>
+            <w:tcW w:type="dxa" w:w="1020"/>
           </w:tcPr>
           <w:p>
             <w:pPr>
               <w:jc w:val="center"/>
             </w:pPr>
+            <w:r/>
             <w:r>
               <w:rPr>
                 <w:rFonts w:ascii="Calibri" w:hAnsi="Calibri"/>
-                <w:sz w:val="18"/>
-              </w:rPr>
-              <w:t>SHOULD</w:t>
-            </w:r>
-          </w:p>
-        </w:tc>
-        <w:tc>
-          <w:tcPr>
-            <w:tcW w:type="dxa" w:w="850"/>
-          </w:tcPr>
-          <w:p>
-            <w:pPr>
-              <w:jc w:val="center"/>
-            </w:pPr>
-            <w:r>
-              <w:rPr>
-                <w:rFonts w:ascii="Calibri" w:hAnsi="Calibri"/>
-                <w:b/>
-                <w:color w:val="008000"/>
+                <w:color w:val="228B22"/>
                 <w:sz w:val="18"/>
               </w:rPr>
               <w:t>Fully Met</w:t>
@@ -3205,12 +2774,13 @@
         </w:tc>
         <w:tc>
           <w:tcPr>
-            <w:tcW w:type="dxa" w:w="964"/>
+            <w:tcW w:type="dxa" w:w="1020"/>
           </w:tcPr>
           <w:p>
             <w:pPr>
               <w:jc w:val="center"/>
             </w:pPr>
+            <w:r/>
             <w:r>
               <w:rPr>
                 <w:rFonts w:ascii="Calibri" w:hAnsi="Calibri"/>
@@ -3222,15 +2792,16 @@
         </w:tc>
         <w:tc>
           <w:tcPr>
-            <w:tcW w:type="dxa" w:w="4535"/>
+            <w:tcW w:type="dxa" w:w="4819"/>
           </w:tcPr>
           <w:p>
+            <w:r/>
             <w:r>
               <w:rPr>
                 <w:rFonts w:ascii="Calibri" w:hAnsi="Calibri"/>
                 <w:sz w:val="18"/>
               </w:rPr>
-              <w:t>Detected via keyword and metric analysis. Uses negation-aware detection so phrases like "no critical issue" are not flagged as critical.</w:t>
+              <w:t>Warnings are detected through keyword and metric analysis, with negation-aware logic so that phrases like "no critical issue" are not misclassified.</w:t>
             </w:r>
           </w:p>
         </w:tc>
@@ -3238,12 +2809,13 @@
       <w:tr>
         <w:tc>
           <w:tcPr>
-            <w:tcW w:type="dxa" w:w="737"/>
+            <w:tcW w:type="dxa" w:w="850"/>
           </w:tcPr>
           <w:p>
             <w:pPr>
               <w:jc w:val="center"/>
             </w:pPr>
+            <w:r/>
             <w:r>
               <w:rPr>
                 <w:rFonts w:ascii="Calibri" w:hAnsi="Calibri"/>
@@ -3255,9 +2827,13 @@
         </w:tc>
         <w:tc>
           <w:tcPr>
-            <w:tcW w:type="dxa" w:w="1814"/>
+            <w:tcW w:type="dxa" w:w="1984"/>
           </w:tcPr>
           <w:p>
+            <w:pPr>
+              <w:jc w:val="center"/>
+            </w:pPr>
+            <w:r/>
             <w:r>
               <w:rPr>
                 <w:rFonts w:ascii="Calibri" w:hAnsi="Calibri"/>
@@ -3269,34 +2845,17 @@
         </w:tc>
         <w:tc>
           <w:tcPr>
-            <w:tcW w:type="dxa" w:w="737"/>
+            <w:tcW w:type="dxa" w:w="1020"/>
           </w:tcPr>
           <w:p>
             <w:pPr>
               <w:jc w:val="center"/>
             </w:pPr>
+            <w:r/>
             <w:r>
               <w:rPr>
                 <w:rFonts w:ascii="Calibri" w:hAnsi="Calibri"/>
-                <w:sz w:val="18"/>
-              </w:rPr>
-              <w:t>SHOULD</w:t>
-            </w:r>
-          </w:p>
-        </w:tc>
-        <w:tc>
-          <w:tcPr>
-            <w:tcW w:type="dxa" w:w="850"/>
-          </w:tcPr>
-          <w:p>
-            <w:pPr>
-              <w:jc w:val="center"/>
-            </w:pPr>
-            <w:r>
-              <w:rPr>
-                <w:rFonts w:ascii="Calibri" w:hAnsi="Calibri"/>
-                <w:b/>
-                <w:color w:val="008000"/>
+                <w:color w:val="228B22"/>
                 <w:sz w:val="18"/>
               </w:rPr>
               <w:t>Fully Met</w:t>
@@ -3305,12 +2864,13 @@
         </w:tc>
         <w:tc>
           <w:tcPr>
-            <w:tcW w:type="dxa" w:w="964"/>
+            <w:tcW w:type="dxa" w:w="1020"/>
           </w:tcPr>
           <w:p>
             <w:pPr>
               <w:jc w:val="center"/>
             </w:pPr>
+            <w:r/>
             <w:r>
               <w:rPr>
                 <w:rFonts w:ascii="Calibri" w:hAnsi="Calibri"/>
@@ -3322,42 +2882,24 @@
         </w:tc>
         <w:tc>
           <w:tcPr>
-            <w:tcW w:type="dxa" w:w="4535"/>
+            <w:tcW w:type="dxa" w:w="4819"/>
           </w:tcPr>
           <w:p>
+            <w:r/>
             <w:r>
               <w:rPr>
                 <w:rFonts w:ascii="Calibri" w:hAnsi="Calibri"/>
                 <w:sz w:val="18"/>
               </w:rPr>
-              <w:t>Green styling for normal responses. A strong normal signal can override minor warning keywords to avoid unnecessary alarm.</w:t>
+              <w:t>Normal responses appear in green. A strong normal signal can override minor warning keywords to avoid false alarms.</w:t>
             </w:r>
           </w:p>
         </w:tc>
       </w:tr>
     </w:tbl>
-    <w:p/>
-    <w:p>
-      <w:r>
-        <w:rPr>
-          <w:rFonts w:ascii="Calibri" w:hAnsi="Calibri"/>
-          <w:sz w:val="22"/>
-        </w:rPr>
-        <w:t>The two unimplemented scenarios are both SHOULD-haves. BR6.2 (inserting dictated text at the cursor position rather than appending) was deprioritised in favour of getting the core voice pipeline working reliably. BR7.3 (wake word activation) was not implemented because it would require an always-on microphone listener, which conflicts with our local-first, privacy-focused design and would increase background resource consumption.</w:t>
-      </w:r>
-    </w:p>
-    <w:p>
-      <w:r>
-        <w:rPr>
-          <w:rFonts w:ascii="Calibri" w:hAnsi="Calibri"/>
-          <w:sz w:val="22"/>
-        </w:rPr>
-        <w:t>All other modifications were intentional improvements. We switched from IBM Granite STT to faster-whisper for speech recognition (BR6.1) to keep everything running locally without an internet dependency. The silence detection threshold was reduced from 3 seconds to 2 (BR6.3, BR7.2) after user testing showed 3 seconds felt unresponsive. Chat export (BR3.4) was expanded to support JSON and Markdown alongside plain text, which we felt would be useful for developers wanting to work with the data programmatically.</w:t>
-      </w:r>
-    </w:p>
     <w:sectPr>
       <w:pgSz w:w="12240" w:h="15840"/>
-      <w:pgMar w:top="1134" w:right="1134" w:bottom="1134" w:left="1134" w:header="720" w:footer="720" w:gutter="0"/>
+      <w:pgMar w:top="1440" w:right="1800" w:bottom="1440" w:left="1800" w:header="720" w:footer="720" w:gutter="0"/>
       <w:cols w:space="720"/>
       <w:docGrid w:linePitch="360"/>
     </w:sectPr>
@@ -3730,7 +3272,7 @@
     <w:rsid w:val="00FC693F"/>
     <w:rPr>
       <w:rFonts w:ascii="Calibri" w:hAnsi="Calibri"/>
-      <w:sz w:val="22"/>
+      <w:sz w:val="20"/>
     </w:rPr>
   </w:style>
   <w:style w:type="paragraph" w:styleId="Header">

</xml_diff>